<commit_message>
added surface spline coding
</commit_message>
<xml_diff>
--- a/Greedy Cup Molten Salt Reactor/GreedyCupConceptULIMES.docx
+++ b/Greedy Cup Molten Salt Reactor/GreedyCupConceptULIMES.docx
@@ -109,7 +109,31 @@
     </w:p>
     <w:p>
       <w:r>
-        <w:t xml:space="preserve">This revision focuses on passive safety and material compatibility, using lead or LBE coolant for its high boiling point, low reactivity, and natural circulation advantages without pumps. The power conversion employs a closed Brayton cycle with supercritical CO₂ or nitrogen, achieving high efficiency (&gt;40%) at outlet temperatures of 650-700°C. Water is only introduced post-turbine in a distant combined cycle setup for additional efficiency, ensuring no interaction with molten lead or salt to prevent explosions or corrosion. The greedy cup provides reliable passive drainage, distinct from </w:t>
+        <w:t xml:space="preserve">This revision focuses on passive safety and material compatibility, using lead or LBE coolant for its high boiling point, low reactivity, and natural circulation advantages without pumps. The power conversion employs a closed Brayton cycle with supercritical CO₂ or nitrogen, achieving </w:t>
+      </w:r>
+      <w:r>
+        <w:t>modest</w:t>
+      </w:r>
+      <w:r>
+        <w:t xml:space="preserve"> efficiency (</w:t>
+      </w:r>
+      <w:r>
+        <w:t>20-40</w:t>
+      </w:r>
+      <w:r>
+        <w:t xml:space="preserve">%) at outlet temperatures of </w:t>
+      </w:r>
+      <w:r>
+        <w:t>400-420</w:t>
+      </w:r>
+      <w:r>
+        <w:t>°C</w:t>
+      </w:r>
+      <w:r>
+        <w:t xml:space="preserve">. </w:t>
+      </w:r>
+      <w:r>
+        <w:t xml:space="preserve">Water is only introduced post-turbine in a distant combined cycle setup for additional efficiency, ensuring no interaction with molten lead or salt to prevent explosions or corrosion. The greedy cup provides reliable passive drainage, distinct from </w:t>
       </w:r>
       <w:proofErr w:type="gramStart"/>
       <w:r>
@@ -122,6 +146,25 @@
       <w:r>
         <w:t xml:space="preserve"> </w:t>
       </w:r>
+      <w:r>
+        <w:t xml:space="preserve">Outlet temperatures are kept relatively low </w:t>
+      </w:r>
+      <w:proofErr w:type="gramStart"/>
+      <w:r>
+        <w:t>in order to</w:t>
+      </w:r>
+      <w:proofErr w:type="gramEnd"/>
+      <w:r>
+        <w:t xml:space="preserve"> </w:t>
+      </w:r>
+      <w:proofErr w:type="gramStart"/>
+      <w:r>
+        <w:t>avoid lead</w:t>
+      </w:r>
+      <w:proofErr w:type="gramEnd"/>
+      <w:r>
+        <w:t xml:space="preserve"> vaporization in accident scenarios and reduce corrosion.</w:t>
+      </w:r>
     </w:p>
     <w:p>
       <w:r>
@@ -133,7 +176,13 @@
       </w:r>
       <w:proofErr w:type="gramEnd"/>
       <w:r>
-        <w:t xml:space="preserve"> in separated loops assure that should a line freeze or should the heavy coolant intrude, the other siphons will drain to independent flat storage tanks. </w:t>
+        <w:t xml:space="preserve"> in separated loops assure that should a line freeze or should the heavy coolant intrude, the other siphons will drain to independent flat storage tanks.</w:t>
+      </w:r>
+      <w:r>
+        <w:t xml:space="preserve"> Primary reactivity management would be via control rods and makeup or dilution, poisoning of fuel loop ULIMES. </w:t>
+      </w:r>
+      <w:r>
+        <w:t xml:space="preserve"> </w:t>
       </w:r>
     </w:p>
     <w:p>
@@ -146,6 +195,13 @@
       <w:r>
         <w:t xml:space="preserve"> MWe, with thorium breeding for sustainability and minimal waste.</w:t>
       </w:r>
+      <w:r>
+        <w:t xml:space="preserve"> Though thermal efficiency is comparable to an LWR, day to day refueling and breeding of </w:t>
+      </w:r>
+      <w:r>
+        <w:lastRenderedPageBreak/>
+        <w:t>U233 greatly reduce fuel cost and the simplification and use of Hastelloy low corrosion materials, including flexible metallic hose, reduce capital costs, refurbishment and maintenance cost as well as disposal costs.</w:t>
+      </w:r>
     </w:p>
     <w:p>
       <w:pPr>
@@ -164,7 +220,6 @@
     </w:p>
     <w:p>
       <w:r>
-        <w:lastRenderedPageBreak/>
         <w:t xml:space="preserve">The cylindrical core (~3-4 m diameter, 4-5 m height) maintains radial zoning: central thermal (~30% radius) with solid carbon or </w:t>
       </w:r>
       <w:proofErr w:type="spellStart"/>
@@ -296,19 +351,23 @@
       <w:r>
         <w:t>Gravity-fed fueling from elevated reservoirs supports online refueling via controlled greedy cup activation.</w:t>
       </w:r>
-    </w:p>
-    <w:p>
-      <w:pPr>
-        <w:rPr>
-          <w:b/>
-          <w:bCs/>
-        </w:rPr>
-      </w:pPr>
-      <w:r>
-        <w:rPr>
-          <w:b/>
-          <w:bCs/>
-        </w:rPr>
+      <w:r>
+        <w:t xml:space="preserve"> Control rods cover the nuclear reactivity power defect and are the primary rapid shutdown mechanism. Emergency Core Coolant System ECCS into the fuel loop to dilute the ULIMES fuel concentration works synergistically with the siphon drains for relatively rapid shutdown compared to boron injection in an LWR.</w:t>
+      </w:r>
+    </w:p>
+    <w:p>
+      <w:pPr>
+        <w:rPr>
+          <w:b/>
+          <w:bCs/>
+        </w:rPr>
+      </w:pPr>
+      <w:r>
+        <w:rPr>
+          <w:b/>
+          <w:bCs/>
+        </w:rPr>
+        <w:lastRenderedPageBreak/>
         <w:t>Safety Features</w:t>
       </w:r>
     </w:p>
@@ -358,7 +417,6 @@
           <w:b/>
           <w:bCs/>
         </w:rPr>
-        <w:lastRenderedPageBreak/>
         <w:t>ECCS System</w:t>
       </w:r>
       <w:r>
@@ -490,9 +548,9 @@
           <w:noProof/>
         </w:rPr>
         <w:drawing>
-          <wp:inline distT="0" distB="0" distL="0" distR="0" wp14:anchorId="2D1008BC" wp14:editId="1AE93269">
-            <wp:extent cx="5943600" cy="3343275"/>
-            <wp:effectExtent l="0" t="0" r="0" b="9525"/>
+          <wp:inline distT="0" distB="0" distL="0" distR="0" wp14:anchorId="2D1008BC" wp14:editId="6FBCBF41">
+            <wp:extent cx="4814477" cy="2708143"/>
+            <wp:effectExtent l="0" t="0" r="5715" b="0"/>
             <wp:docPr id="976480024" name="Picture 2" descr="The Greedy Cup Has Become Even More Devious"/>
             <wp:cNvGraphicFramePr>
               <a:graphicFrameLocks xmlns:a="http://schemas.openxmlformats.org/drawingml/2006/main" noChangeAspect="1"/>
@@ -507,7 +565,7 @@
                     </pic:cNvPicPr>
                   </pic:nvPicPr>
                   <pic:blipFill>
-                    <a:blip r:embed="rId5">
+                    <a:blip r:embed="rId5" cstate="print">
                       <a:extLst>
                         <a:ext uri="{28A0092B-C50C-407E-A947-70E740481C1C}">
                           <a14:useLocalDpi xmlns:a14="http://schemas.microsoft.com/office/drawing/2010/main" val="0"/>
@@ -522,7 +580,7 @@
                   <pic:spPr bwMode="auto">
                     <a:xfrm>
                       <a:off x="0" y="0"/>
-                      <a:ext cx="5943600" cy="3343275"/>
+                      <a:ext cx="4822347" cy="2712570"/>
                     </a:xfrm>
                     <a:prstGeom prst="rect">
                       <a:avLst/>
@@ -565,7 +623,6 @@
         </w:numPr>
       </w:pPr>
       <w:r>
-        <w:lastRenderedPageBreak/>
         <w:t>Negative Feedback Coefficients: The mixed spectrum ensures negative void and temperature coefficients, with the thermal zone providing damping.</w:t>
       </w:r>
     </w:p>
@@ -636,6 +693,9 @@
       <w:r>
         <w:t xml:space="preserve"> be covered, reducing any overpower for transient reactivity accidents.</w:t>
       </w:r>
+      <w:r>
+        <w:t xml:space="preserve"> The Control Rods would insert in the thermal region of the reactor, designed to assure that without the softer spectrum thermal region, the reactor will shut down. </w:t>
+      </w:r>
     </w:p>
     <w:p>
       <w:pPr>
@@ -655,6 +715,9 @@
       <w:r>
         <w:t xml:space="preserve"> and economic resources can be concentrated on reliability, safety and cleanliness. </w:t>
       </w:r>
+      <w:r>
+        <w:t xml:space="preserve">In extreme accident scenarios, containment atmosphere may have to be used to provide natural circulation cooling to the primary system. </w:t>
+      </w:r>
     </w:p>
     <w:p>
       <w:pPr>
@@ -664,7 +727,13 @@
         </w:numPr>
       </w:pPr>
       <w:r>
-        <w:t>Use of Lead coolant over the level of the gas overpressure acts as a radiation shield.</w:t>
+        <w:t xml:space="preserve">Use of Lead </w:t>
+      </w:r>
+      <w:r>
+        <w:t xml:space="preserve">or LBE </w:t>
+      </w:r>
+      <w:r>
+        <w:t>coolant over the level of the gas overpressure acts as a radiation shield.</w:t>
       </w:r>
     </w:p>
     <w:p>
@@ -677,6 +746,15 @@
       <w:r>
         <w:t>Should fuel leak, it floats – there is no danger of meltdown.</w:t>
       </w:r>
+      <w:r>
+        <w:t xml:space="preserve"> Aiming for modest outlet temperature, temperature of Lead vaporization of 480 </w:t>
+      </w:r>
+      <w:r>
+        <w:t>°C</w:t>
+      </w:r>
+      <w:r>
+        <w:t xml:space="preserve"> is avoided.</w:t>
+      </w:r>
     </w:p>
     <w:p>
       <w:pPr>
@@ -695,7 +773,62 @@
     </w:p>
     <w:p>
       <w:r>
-        <w:t>Power density: 100-200 kW/L; outlet temperature: 650-700°C; breeding ratio: 1.05-1.1; flow velocity: 0.5-1 m/s. Cycle efficiency: 45-50% with Brayton + combined.</w:t>
+        <w:t xml:space="preserve">Power density: 100-200 kW/L; outlet temperature: </w:t>
+      </w:r>
+      <w:r>
+        <w:t>4</w:t>
+      </w:r>
+      <w:r>
+        <w:t>00</w:t>
+      </w:r>
+      <w:r>
+        <w:t>-420</w:t>
+      </w:r>
+      <w:r>
+        <w:t xml:space="preserve">°C; breeding ratio: 1.05-1.1; flow velocity: 0.5-1 m/s. Cycle efficiency: </w:t>
+      </w:r>
+      <w:r>
+        <w:t>2</w:t>
+      </w:r>
+      <w:r>
+        <w:t>0</w:t>
+      </w:r>
+      <w:r>
+        <w:t>-</w:t>
+      </w:r>
+      <w:r>
+        <w:t>40</w:t>
+      </w:r>
+      <w:r>
+        <w:t>% with Brayton + combined</w:t>
+      </w:r>
+      <w:r>
+        <w:t>. Lower temperatures, 400</w:t>
+      </w:r>
+      <w:r>
+        <w:t>°C</w:t>
+      </w:r>
+      <w:r>
+        <w:t xml:space="preserve"> for ULIMES and flexible metallic hose.</w:t>
+      </w:r>
+      <w:r>
+        <w:t xml:space="preserve"> More modest temperatures </w:t>
+      </w:r>
+      <w:proofErr w:type="gramStart"/>
+      <w:r>
+        <w:t>reduces</w:t>
+      </w:r>
+      <w:proofErr w:type="gramEnd"/>
+      <w:r>
+        <w:t xml:space="preserve"> maintenance cost and </w:t>
+      </w:r>
+      <w:proofErr w:type="gramStart"/>
+      <w:r>
+        <w:t>avoids</w:t>
+      </w:r>
+      <w:proofErr w:type="gramEnd"/>
+      <w:r>
+        <w:t xml:space="preserve"> Led vapors in accident scenarios. </w:t>
       </w:r>
     </w:p>
     <w:p>
@@ -725,6 +858,7 @@
     </w:p>
     <w:p>
       <w:r>
+        <w:lastRenderedPageBreak/>
         <w:t>The old hose can be inspected and repaired after decontamination for refurbishment.</w:t>
       </w:r>
     </w:p>
@@ -773,7 +907,6 @@
           <w:b/>
           <w:bCs/>
         </w:rPr>
-        <w:lastRenderedPageBreak/>
         <w:t>Lead compatibility</w:t>
       </w:r>
       <w:r>
@@ -969,17 +1102,19 @@
         <w:t>C</w:t>
       </w:r>
       <w:r>
-        <w:t>oncept is not only possible — the exact hardware (Hastelloy flexible corrugated + braided hose) already exists from multiple manufacturers and is used daily in similar corrosive, high-temperature service. It directly supports the pull-and-restring maintenance idea you described.</w:t>
-      </w:r>
-    </w:p>
-    <w:p>
-      <w:proofErr w:type="spellStart"/>
-      <w:r>
-        <w:t>MessageObject</w:t>
-      </w:r>
-      <w:proofErr w:type="spellEnd"/>
-      <w:r>
-        <w:t xml:space="preserve"> log: “Hastelloy flexible metallic hose feasibility confirmed — commercially available (</w:t>
+        <w:t>oncept is not only possible — the exact hardware (Hastelloy flexible corrugated + braided hose) already exists from multiple manufacturers and is used daily in similar corrosive, high-temperature service. It directly supports the pull-and-restring maintenance idea.</w:t>
+      </w:r>
+    </w:p>
+    <w:p>
+      <w:pPr>
+        <w:rPr>
+          <w:b/>
+          <w:bCs/>
+        </w:rPr>
+      </w:pPr>
+      <w:r>
+        <w:lastRenderedPageBreak/>
+        <w:t>“Hastelloy flexible metallic hose feasibility confirmed — commercially available (</w:t>
       </w:r>
       <w:proofErr w:type="spellStart"/>
       <w:r>
@@ -1006,29 +1141,12 @@
         <w:t>), excellent for ULIMES fuel carrier in lead moderator with easy pull/restring maintenance.”</w:t>
       </w:r>
     </w:p>
-    <w:p/>
-    <w:p>
-      <w:pPr>
-        <w:rPr>
-          <w:b/>
-          <w:bCs/>
-        </w:rPr>
-      </w:pPr>
-      <w:r>
-        <w:rPr>
-          <w:b/>
-          <w:bCs/>
-        </w:rPr>
-        <w:br w:type="page"/>
-      </w:r>
-    </w:p>
-    <w:p>
-      <w:r>
-        <w:rPr>
-          <w:b/>
-          <w:bCs/>
-        </w:rPr>
-        <w:lastRenderedPageBreak/>
+    <w:p>
+      <w:r>
+        <w:rPr>
+          <w:b/>
+          <w:bCs/>
+        </w:rPr>
         <w:t>Greedy Cup and ECCS Integration (ASCII Art)</w:t>
       </w:r>
       <w:r>
@@ -1489,6 +1607,17 @@
       <w:r>
         <w:t>-UF₄), with uranium enriched to ~5-10% U-235 initially, transitioning to bred U-233 from the thorium blanket.</w:t>
       </w:r>
+      <w:r>
+        <w:t xml:space="preserve"> Much higher operating temperatures and thermal efficiency possible, however, use of Florine is chemically </w:t>
+      </w:r>
+      <w:proofErr w:type="gramStart"/>
+      <w:r>
+        <w:t>difficult</w:t>
+      </w:r>
+      <w:proofErr w:type="gramEnd"/>
+      <w:r>
+        <w:t xml:space="preserve"> and corrosion costs will increase. </w:t>
+      </w:r>
     </w:p>
     <w:p>
       <w:pPr>
@@ -1670,6 +1799,7 @@
     </w:p>
     <w:p>
       <w:r>
+        <w:lastRenderedPageBreak/>
         <w:t>Thermal conductivity quantifies intrinsic heat conduction through the material. For ULIMES, it is enhanced compared to traditional sintered UO₂ pellets due to the liquid metal matrix suspending UO₂ particles, reducing thermal resistance.</w:t>
       </w:r>
     </w:p>
@@ -1685,7 +1815,6 @@
           <w:b/>
           <w:bCs/>
         </w:rPr>
-        <w:lastRenderedPageBreak/>
         <w:t>ULIMES (UO₂ in Pb-Sn Liquid Metal Suspension)</w:t>
       </w:r>
       <w:r>
@@ -2573,6 +2702,7 @@
           <w:b/>
           <w:bCs/>
         </w:rPr>
+        <w:lastRenderedPageBreak/>
         <w:t>Lead Coolant (Pure Liquid Lead)</w:t>
       </w:r>
       <w:r>
@@ -2634,7 +2764,6 @@
         </w:numPr>
       </w:pPr>
       <w:r>
-        <w:lastRenderedPageBreak/>
         <w:t>Values:</w:t>
       </w:r>
     </w:p>
@@ -3019,6 +3148,7 @@
           <w:b/>
           <w:bCs/>
         </w:rPr>
+        <w:lastRenderedPageBreak/>
         <w:t>Lead Coolant Loop (Natural Circulation)</w:t>
       </w:r>
       <w:r>
@@ -3049,7 +3179,6 @@
         </w:numPr>
       </w:pPr>
       <w:r>
-        <w:lastRenderedPageBreak/>
         <w:t>Correlation for liquid metal natural convection (e.g., in RCCS-like pools): Nu = 0.565 Ra</w:t>
       </w:r>
       <w:proofErr w:type="gramStart"/>
@@ -3395,11 +3524,11 @@
       </w:r>
       <w:proofErr w:type="spellEnd"/>
       <w:r>
-        <w:t xml:space="preserve">) as a solid moderator in the thermal region of a mixed-spectrum Greedy Cup ULIMES (UO₂-liquid metal suspension)-fueled reactor design, tailored for compact applications such as naval propulsion systems. Naval reactors often operate at reduced power levels (e.g., approximately one-third of full power during cruise modes) to optimize fuel efficiency and stealth, necessitating highly compact cores with efficient neutron moderation to minimize size while maintaining criticality and safety margins. The design incorporates natural circulation for both fuel and coolant loops (using lead or lead-bismuth eutectic), ECCS </w:t>
+        <w:t xml:space="preserve">) as a solid moderator in the thermal region of a mixed-spectrum Greedy Cup ULIMES (UO₂-liquid metal suspension)-fueled reactor design, tailored for compact applications such as naval propulsion systems. Naval reactors often operate at reduced power levels (e.g., </w:t>
       </w:r>
       <w:r>
         <w:lastRenderedPageBreak/>
-        <w:t>molten salt injection (potentially in solid form) for passive drainage via the greedy cup mechanism, a central thermal zone with solid moderators (preferring Be₂</w:t>
+        <w:t>approximately one-third of full power during cruise modes) to optimize fuel efficiency and stealth, necessitating highly compact cores with efficient neutron moderation to minimize size while maintaining criticality and safety margins. The design incorporates natural circulation for both fuel and coolant loops (using lead or lead-bismuth eutectic), ECCS molten salt injection (potentially in solid form) for passive drainage via the greedy cup mechanism, a central thermal zone with solid moderators (preferring Be₂</w:t>
       </w:r>
       <w:proofErr w:type="spellStart"/>
       <w:r>
@@ -3767,6 +3896,7 @@
         <w:rPr>
           <w:rFonts w:eastAsia="Times New Roman"/>
         </w:rPr>
+        <w:lastRenderedPageBreak/>
         <w:t>Thermal conductivity: ~1.81 W/</w:t>
       </w:r>
       <w:proofErr w:type="spellStart"/>
@@ -3845,7 +3975,6 @@
         <w:rPr>
           <w:rFonts w:eastAsia="Times New Roman"/>
         </w:rPr>
-        <w:lastRenderedPageBreak/>
         <w:t>Density: 2.44 g/cm³, enabling denser packing in hexagonal assemblies and contributing to core compactness.</w:t>
       </w:r>
     </w:p>
@@ -3936,7 +4065,7 @@
     </w:p>
     <w:p>
       <w:r>
-        <w:t xml:space="preserve">In naval reactors, core compactness is critical for space constraints in submarines or ships, where traditional PWRs use water moderation but advanced designs like benefit from solid moderators for high-temperature operation. </w:t>
+        <w:t xml:space="preserve">In naval reactors, core compactness is critical for space constraints in submarines or ships, where traditional PWRs use water moderation but advanced designs benefit from solid moderators for high-temperature operation. </w:t>
       </w:r>
       <w:proofErr w:type="spellStart"/>
       <w:r>
@@ -4113,6 +4242,7 @@
     </w:p>
     <w:p>
       <w:r>
+        <w:lastRenderedPageBreak/>
         <w:t>Simulations of Be-based composites (e.g., MgO-</w:t>
       </w:r>
       <w:proofErr w:type="spellStart"/>
@@ -4142,7 +4272,6 @@
     <w:p>
       <w:proofErr w:type="spellStart"/>
       <w:r>
-        <w:lastRenderedPageBreak/>
         <w:t>Be₂C</w:t>
       </w:r>
       <w:proofErr w:type="spellEnd"/>
@@ -4163,7 +4292,23 @@
     </w:p>
     <w:p>
       <w:r>
-        <w:t xml:space="preserve">[Note: Greedy cup probably not useful for naval applications as it is too extreme for shutdown. </w:t>
+        <w:t>[</w:t>
+      </w:r>
+      <w:r>
+        <w:rPr>
+          <w:b/>
+          <w:bCs/>
+        </w:rPr>
+        <w:t>Note</w:t>
+      </w:r>
+      <w:r>
+        <w:t>: Greedy cup probably not useful for</w:t>
+      </w:r>
+      <w:r>
+        <w:t xml:space="preserve"> combat military</w:t>
+      </w:r>
+      <w:r>
+        <w:t xml:space="preserve"> naval applications as it is too extreme for shutdown. </w:t>
       </w:r>
       <w:proofErr w:type="gramStart"/>
       <w:r>
@@ -4171,7 +4316,25 @@
       </w:r>
       <w:proofErr w:type="gramEnd"/>
       <w:r>
-        <w:t xml:space="preserve"> the Greedy cup reactor would be perfect for commercial AND prototype training reactors.]</w:t>
+        <w:t xml:space="preserve"> the Greedy cup reactor </w:t>
+      </w:r>
+      <w:r>
+        <w:t xml:space="preserve">safety feature </w:t>
+      </w:r>
+      <w:r>
+        <w:t xml:space="preserve">would be perfect for commercial AND prototype </w:t>
+      </w:r>
+      <w:r>
+        <w:t xml:space="preserve">naval </w:t>
+      </w:r>
+      <w:r>
+        <w:t>training reactors.</w:t>
+      </w:r>
+      <w:r>
+        <w:t xml:space="preserve"> These would be land applications</w:t>
+      </w:r>
+      <w:r>
+        <w:t>]</w:t>
       </w:r>
     </w:p>
     <w:p>
@@ -4355,6 +4518,7 @@
           <w:b/>
           <w:bCs/>
         </w:rPr>
+        <w:lastRenderedPageBreak/>
         <w:t>Public Domain Document: Contact Resources for ULIMES Fuel Development at ORNL in Support of Advanced Greedy Cup Reactor Designs</w:t>
       </w:r>
     </w:p>
@@ -4375,7 +4539,6 @@
     </w:p>
     <w:p>
       <w:r>
-        <w:lastRenderedPageBreak/>
         <w:t xml:space="preserve">This document compiles publicly available contact information for key researchers involved in the Uranium Dioxide Liquid Metal Suspension (ULIMES) fuel concept at Oak Ridge National Laboratory (ORNL). ULIMES, consisting of </w:t>
       </w:r>
       <w:proofErr w:type="spellStart"/>
@@ -4490,6 +4653,7 @@
           <w:b/>
           <w:bCs/>
         </w:rPr>
+        <w:lastRenderedPageBreak/>
         <w:t>Additional Contact</w:t>
       </w:r>
       <w:r>
@@ -4508,7 +4672,6 @@
           <w:b/>
           <w:bCs/>
         </w:rPr>
-        <w:lastRenderedPageBreak/>
         <w:t>Marie Romedenne</w:t>
       </w:r>
       <w:r>
@@ -4701,6 +4864,1174 @@
       <w:r>
         <w:t>Use the provided emails for professional inquiries, citing public interest in advancing ULIMES for sustainable nuclear propulsion. This document promotes open collaboration under public domain principles.</w:t>
       </w:r>
+    </w:p>
+    <w:p>
+      <w:r>
+        <w:lastRenderedPageBreak/>
+        <w:t>Initial more modest temperatures to avoid corrosion problems in primary loop and utilize ULIMES fuel.</w:t>
+      </w:r>
+    </w:p>
+    <w:p>
+      <w:r>
+        <w:t>B</w:t>
+      </w:r>
+      <w:r>
+        <w:t xml:space="preserve">oth nitrogen (N₂) and carbon dioxide (CO₂) can be used as working fluids in a Brayton cycle at 400°C (673 K), particularly in closed-cycle configurations where the fluid is recirculated. This temperature is feasible as a turbine inlet or heat addition point, though it's on the lower end for achieving high efficiency in conventional gas turbines (which often target 800–1200°C for better performance). </w:t>
+      </w:r>
+      <w:proofErr w:type="gramStart"/>
+      <w:r>
+        <w:t>Below,</w:t>
+      </w:r>
+      <w:proofErr w:type="gramEnd"/>
+      <w:r>
+        <w:t xml:space="preserve"> </w:t>
+      </w:r>
+      <w:r>
+        <w:t xml:space="preserve">is </w:t>
+      </w:r>
+      <w:r>
+        <w:t>explain</w:t>
+      </w:r>
+      <w:r>
+        <w:t>ed</w:t>
+      </w:r>
+      <w:r>
+        <w:t xml:space="preserve"> the context, feasibility, and key considerations for each fluid.</w:t>
+      </w:r>
+    </w:p>
+    <w:p>
+      <w:pPr>
+        <w:rPr>
+          <w:b/>
+          <w:bCs/>
+        </w:rPr>
+      </w:pPr>
+      <w:r>
+        <w:rPr>
+          <w:b/>
+          <w:bCs/>
+        </w:rPr>
+        <w:t>General Feasibility in Brayton Cycles</w:t>
+      </w:r>
+    </w:p>
+    <w:p>
+      <w:pPr>
+        <w:numPr>
+          <w:ilvl w:val="0"/>
+          <w:numId w:val="21"/>
+        </w:numPr>
+      </w:pPr>
+      <w:r>
+        <w:t>The Brayton cycle involves isentropic compression, constant-pressure heat addition, isentropic expansion, and constant-pressure heat rejection. Air is the standard working fluid in open cycles (e.g., jet engines), but closed cycles allow alternatives like N₂ or CO₂ for specialized applications such as power generation, cryocoolers, or nuclear reactors.</w:t>
+      </w:r>
+    </w:p>
+    <w:p>
+      <w:pPr>
+        <w:numPr>
+          <w:ilvl w:val="0"/>
+          <w:numId w:val="21"/>
+        </w:numPr>
+      </w:pPr>
+      <w:r>
+        <w:t>At 400°C, both gases remain stable and gaseous (no phase change issues under typical pressures). However, cycle efficiency (η) depends on the pressure ratio (</w:t>
+      </w:r>
+      <w:proofErr w:type="spellStart"/>
+      <w:r>
+        <w:t>r_p</w:t>
+      </w:r>
+      <w:proofErr w:type="spellEnd"/>
+      <w:r>
+        <w:t xml:space="preserve"> = </w:t>
+      </w:r>
+      <w:proofErr w:type="spellStart"/>
+      <w:r>
+        <w:t>P_high</w:t>
+      </w:r>
+      <w:proofErr w:type="spellEnd"/>
+      <w:r>
+        <w:t xml:space="preserve"> / </w:t>
+      </w:r>
+      <w:proofErr w:type="spellStart"/>
+      <w:r>
+        <w:t>P_low</w:t>
+      </w:r>
+      <w:proofErr w:type="spellEnd"/>
+      <w:r>
+        <w:t>) and maximum temperature (T_max), roughly η ≈ 1 - (1/</w:t>
+      </w:r>
+      <w:proofErr w:type="spellStart"/>
+      <w:r>
+        <w:t>r_p</w:t>
+      </w:r>
+      <w:proofErr w:type="spellEnd"/>
+      <w:r>
+        <w:t>)^((γ-1)/γ), where γ is the specific heat ratio (≈1.4 for diatomic gases like N₂, ≈1.3 for CO₂).</w:t>
+      </w:r>
+    </w:p>
+    <w:p>
+      <w:pPr>
+        <w:numPr>
+          <w:ilvl w:val="0"/>
+          <w:numId w:val="21"/>
+        </w:numPr>
+      </w:pPr>
+      <w:r>
+        <w:t xml:space="preserve">Lower T_max like 400°C yields efficiencies around 20–40% (depending on </w:t>
+      </w:r>
+      <w:proofErr w:type="spellStart"/>
+      <w:r>
+        <w:t>r_p</w:t>
+      </w:r>
+      <w:proofErr w:type="spellEnd"/>
+      <w:r>
+        <w:t xml:space="preserve"> = 5–20), compared to 50–60% at higher temperatures. This makes it suitable for low-grade heat sources (e.g., geothermal, waste heat recovery) but less ideal for high-power applications.</w:t>
+      </w:r>
+    </w:p>
+    <w:p>
+      <w:pPr>
+        <w:rPr>
+          <w:b/>
+          <w:bCs/>
+        </w:rPr>
+      </w:pPr>
+      <w:r>
+        <w:rPr>
+          <w:b/>
+          <w:bCs/>
+        </w:rPr>
+        <w:t>Using Nitrogen (N₂) at 400°C</w:t>
+      </w:r>
+    </w:p>
+    <w:p>
+      <w:pPr>
+        <w:numPr>
+          <w:ilvl w:val="0"/>
+          <w:numId w:val="22"/>
+        </w:numPr>
+      </w:pPr>
+      <w:r>
+        <w:rPr>
+          <w:b/>
+          <w:bCs/>
+        </w:rPr>
+        <w:t>Feasibility</w:t>
+      </w:r>
+      <w:r>
+        <w:t>: N₂ is commonly used in closed Brayton cycles, especially for cryogenic cooling (reverse Brayton) or nuclear applications like sodium-cooled fast reactors (SFRs). It's inert, non-reactive with sodium coolants, eco-friendly, and safe. Examples include prototypes tested at pressures of 8–18 bar and temperatures down to -140°C on the cold side, but it scales to higher temps like 400°C.</w:t>
+      </w:r>
+    </w:p>
+    <w:p>
+      <w:pPr>
+        <w:numPr>
+          <w:ilvl w:val="0"/>
+          <w:numId w:val="22"/>
+        </w:numPr>
+      </w:pPr>
+      <w:r>
+        <w:rPr>
+          <w:b/>
+          <w:bCs/>
+        </w:rPr>
+        <w:t>Advantages</w:t>
+      </w:r>
+      <w:r>
+        <w:t>:</w:t>
+      </w:r>
+    </w:p>
+    <w:p>
+      <w:pPr>
+        <w:numPr>
+          <w:ilvl w:val="1"/>
+          <w:numId w:val="22"/>
+        </w:numPr>
+      </w:pPr>
+      <w:r>
+        <w:t>High stability at 400°C (no decomposition).</w:t>
+      </w:r>
+    </w:p>
+    <w:p>
+      <w:pPr>
+        <w:numPr>
+          <w:ilvl w:val="1"/>
+          <w:numId w:val="22"/>
+        </w:numPr>
+      </w:pPr>
+      <w:r>
+        <w:t>Good thermodynamic properties: γ ≈ 1.4, specific heat (</w:t>
+      </w:r>
+      <w:proofErr w:type="spellStart"/>
+      <w:r>
+        <w:t>c_p</w:t>
+      </w:r>
+      <w:proofErr w:type="spellEnd"/>
+      <w:r>
+        <w:t>) ≈ 1.04 kJ/</w:t>
+      </w:r>
+      <w:proofErr w:type="spellStart"/>
+      <w:r>
+        <w:t>kg·K</w:t>
+      </w:r>
+      <w:proofErr w:type="spellEnd"/>
+      <w:r>
+        <w:t>.</w:t>
+      </w:r>
+    </w:p>
+    <w:p>
+      <w:pPr>
+        <w:numPr>
+          <w:ilvl w:val="1"/>
+          <w:numId w:val="22"/>
+        </w:numPr>
+      </w:pPr>
+      <w:r>
+        <w:t>Used in intercooled or regenerative cycles for efficiency gains.</w:t>
+      </w:r>
+    </w:p>
+    <w:p>
+      <w:pPr>
+        <w:numPr>
+          <w:ilvl w:val="0"/>
+          <w:numId w:val="22"/>
+        </w:numPr>
+      </w:pPr>
+      <w:r>
+        <w:rPr>
+          <w:b/>
+          <w:bCs/>
+        </w:rPr>
+        <w:lastRenderedPageBreak/>
+        <w:t>Applications and Examples</w:t>
+      </w:r>
+      <w:r>
+        <w:t>:</w:t>
+      </w:r>
+    </w:p>
+    <w:p>
+      <w:pPr>
+        <w:numPr>
+          <w:ilvl w:val="1"/>
+          <w:numId w:val="22"/>
+        </w:numPr>
+      </w:pPr>
+      <w:r>
+        <w:t>Cryocoolers: N₂ Brayton prototypes achieve cooling effects of 15–20 kW with coefficients of performance (COP) up to 1.34 (including waste heat recovery).</w:t>
+      </w:r>
+    </w:p>
+    <w:p>
+      <w:pPr>
+        <w:numPr>
+          <w:ilvl w:val="1"/>
+          <w:numId w:val="22"/>
+        </w:numPr>
+      </w:pPr>
+      <w:r>
+        <w:t xml:space="preserve">Nuclear: Coupled to small modular SFRs (e.g., 500 </w:t>
+      </w:r>
+      <w:proofErr w:type="spellStart"/>
+      <w:r>
+        <w:t>MWth</w:t>
+      </w:r>
+      <w:proofErr w:type="spellEnd"/>
+      <w:r>
+        <w:t>) for power generation, with turbine inlet temps around 400–600°C.</w:t>
+      </w:r>
+    </w:p>
+    <w:p>
+      <w:pPr>
+        <w:numPr>
+          <w:ilvl w:val="1"/>
+          <w:numId w:val="22"/>
+        </w:numPr>
+      </w:pPr>
+      <w:r>
+        <w:t>Reacting variants: N₂ tetroxide (N₂O₄) has been studied for performance boosts in closed cycles.</w:t>
+      </w:r>
+    </w:p>
+    <w:p>
+      <w:pPr>
+        <w:numPr>
+          <w:ilvl w:val="0"/>
+          <w:numId w:val="22"/>
+        </w:numPr>
+      </w:pPr>
+      <w:r>
+        <w:rPr>
+          <w:b/>
+          <w:bCs/>
+        </w:rPr>
+        <w:t>Challenges</w:t>
+      </w:r>
+      <w:r>
+        <w:t>: Lower efficiency at 400°C unless paired with high pressure ratios or regeneration. Not ideal for open cycles due to sourcing/purity needs.</w:t>
+      </w:r>
+    </w:p>
+    <w:p>
+      <w:pPr>
+        <w:rPr>
+          <w:b/>
+          <w:bCs/>
+        </w:rPr>
+      </w:pPr>
+      <w:r>
+        <w:rPr>
+          <w:b/>
+          <w:bCs/>
+        </w:rPr>
+        <w:t>Using Carbon Dioxide (CO₂) at 400°C</w:t>
+      </w:r>
+    </w:p>
+    <w:p>
+      <w:pPr>
+        <w:numPr>
+          <w:ilvl w:val="0"/>
+          <w:numId w:val="23"/>
+        </w:numPr>
+      </w:pPr>
+      <w:r>
+        <w:rPr>
+          <w:b/>
+          <w:bCs/>
+        </w:rPr>
+        <w:t>Feasibility</w:t>
+      </w:r>
+      <w:r>
+        <w:t xml:space="preserve">: </w:t>
+      </w:r>
+      <w:r>
+        <w:t>E</w:t>
+      </w:r>
+      <w:r>
+        <w:t>specially in supercritical CO₂ (</w:t>
+      </w:r>
+      <w:proofErr w:type="spellStart"/>
+      <w:r>
+        <w:t>sCO</w:t>
+      </w:r>
+      <w:proofErr w:type="spellEnd"/>
+      <w:r>
+        <w:t>₂) Brayton cycles, where CO₂ operates above its critical point (31°C, 73.8 bar) for compact, efficient designs. At 400°C and high pressures, it's supercritical, behaving like a dense gas with excellent heat transfer. Pure CO₂ or mixtures (e.g., with Kr, Xe, CH₄) are researched for this.</w:t>
+      </w:r>
+    </w:p>
+    <w:p>
+      <w:pPr>
+        <w:numPr>
+          <w:ilvl w:val="0"/>
+          <w:numId w:val="23"/>
+        </w:numPr>
+      </w:pPr>
+      <w:r>
+        <w:rPr>
+          <w:b/>
+          <w:bCs/>
+        </w:rPr>
+        <w:t>Advantages</w:t>
+      </w:r>
+      <w:r>
+        <w:t>:</w:t>
+      </w:r>
+    </w:p>
+    <w:p>
+      <w:pPr>
+        <w:numPr>
+          <w:ilvl w:val="1"/>
+          <w:numId w:val="23"/>
+        </w:numPr>
+      </w:pPr>
+      <w:r>
+        <w:t>High density in supercritical state reduces component sizes (e.g., turbines 10x smaller than steam equivalents).</w:t>
+      </w:r>
+    </w:p>
+    <w:p>
+      <w:pPr>
+        <w:numPr>
+          <w:ilvl w:val="1"/>
+          <w:numId w:val="23"/>
+        </w:numPr>
+      </w:pPr>
+      <w:r>
+        <w:t xml:space="preserve">γ ≈ 1.3, </w:t>
+      </w:r>
+      <w:proofErr w:type="spellStart"/>
+      <w:r>
+        <w:t>c_p</w:t>
+      </w:r>
+      <w:proofErr w:type="spellEnd"/>
+      <w:r>
+        <w:t xml:space="preserve"> ≈ 0.85–1.2 kJ/</w:t>
+      </w:r>
+      <w:proofErr w:type="spellStart"/>
+      <w:r>
+        <w:t>kg·K</w:t>
+      </w:r>
+      <w:proofErr w:type="spellEnd"/>
+      <w:r>
+        <w:t xml:space="preserve"> (varies with state).</w:t>
+      </w:r>
+    </w:p>
+    <w:p>
+      <w:pPr>
+        <w:numPr>
+          <w:ilvl w:val="1"/>
+          <w:numId w:val="23"/>
+        </w:numPr>
+      </w:pPr>
+      <w:r>
+        <w:t xml:space="preserve">Efficiency improvements: </w:t>
+      </w:r>
+      <w:proofErr w:type="spellStart"/>
+      <w:r>
+        <w:t>sCO</w:t>
+      </w:r>
+      <w:proofErr w:type="spellEnd"/>
+      <w:r>
+        <w:t>₂ cycles can reach 40–50% efficiency at 400–700°C, outperforming steam Rankine cycles.</w:t>
+      </w:r>
+    </w:p>
+    <w:p>
+      <w:pPr>
+        <w:numPr>
+          <w:ilvl w:val="0"/>
+          <w:numId w:val="23"/>
+        </w:numPr>
+      </w:pPr>
+      <w:r>
+        <w:rPr>
+          <w:b/>
+          <w:bCs/>
+        </w:rPr>
+        <w:t>Applications and Examples</w:t>
+      </w:r>
+      <w:r>
+        <w:t>:</w:t>
+      </w:r>
+    </w:p>
+    <w:p>
+      <w:pPr>
+        <w:numPr>
+          <w:ilvl w:val="1"/>
+          <w:numId w:val="23"/>
+        </w:numPr>
+      </w:pPr>
+      <w:r>
+        <w:t xml:space="preserve">Power generation: Used in recompression Brayton cycles (RCBC) for fossil, solar, geothermal, or nuclear plants. Sandia Labs demonstrated 10 kW </w:t>
+      </w:r>
+      <w:proofErr w:type="spellStart"/>
+      <w:r>
+        <w:t>sCO</w:t>
+      </w:r>
+      <w:proofErr w:type="spellEnd"/>
+      <w:r>
+        <w:t>₂ cycles; larger 10 MWe pilots (e.g., STEP Demo) operate at similar temps.</w:t>
+      </w:r>
+    </w:p>
+    <w:p>
+      <w:pPr>
+        <w:numPr>
+          <w:ilvl w:val="1"/>
+          <w:numId w:val="23"/>
+        </w:numPr>
+      </w:pPr>
+      <w:r>
+        <w:t>Geothermal/Waste Heat: CO₂ mixtures (e.g., CO₂/CH₄) suit low-temps (200–500°C), boosting efficiency by 3–10% over pure CO₂.</w:t>
+      </w:r>
+    </w:p>
+    <w:p>
+      <w:pPr>
+        <w:numPr>
+          <w:ilvl w:val="1"/>
+          <w:numId w:val="23"/>
+        </w:numPr>
+      </w:pPr>
+      <w:r>
+        <w:t>Storage/Advanced: In Allam-</w:t>
+      </w:r>
+      <w:proofErr w:type="spellStart"/>
+      <w:r>
+        <w:t>Fetvedt</w:t>
+      </w:r>
+      <w:proofErr w:type="spellEnd"/>
+      <w:r>
+        <w:t xml:space="preserve"> cycles for oxyfuel combustion or pumped thermal energy storage.</w:t>
+      </w:r>
+    </w:p>
+    <w:p>
+      <w:pPr>
+        <w:numPr>
+          <w:ilvl w:val="0"/>
+          <w:numId w:val="23"/>
+        </w:numPr>
+      </w:pPr>
+      <w:r>
+        <w:rPr>
+          <w:b/>
+          <w:bCs/>
+        </w:rPr>
+        <w:lastRenderedPageBreak/>
+        <w:t>Challenges</w:t>
+      </w:r>
+      <w:r>
+        <w:t xml:space="preserve">: Requires high pressures (100–300 bar) for supercritical benefits. At subzero </w:t>
+      </w:r>
+      <w:proofErr w:type="spellStart"/>
+      <w:r>
+        <w:t>ambients</w:t>
+      </w:r>
+      <w:proofErr w:type="spellEnd"/>
+      <w:r>
+        <w:t xml:space="preserve">, mixtures help avoid two-phase issues. Corrosion potential in some </w:t>
+      </w:r>
+      <w:proofErr w:type="gramStart"/>
+      <w:r>
+        <w:t>setups, but</w:t>
+      </w:r>
+      <w:proofErr w:type="gramEnd"/>
+      <w:r>
+        <w:t xml:space="preserve"> mitigated with materials like nickel alloys.</w:t>
+      </w:r>
+    </w:p>
+    <w:p>
+      <w:pPr>
+        <w:numPr>
+          <w:ilvl w:val="0"/>
+          <w:numId w:val="23"/>
+        </w:numPr>
+      </w:pPr>
+      <w:r>
+        <w:t xml:space="preserve">both nitrogen (N₂) and carbon dioxide (CO₂) can be used as working fluids in a Brayton cycle at 400°C (673 K), particularly in closed-cycle configurations where the fluid is recirculated. This temperature is feasible as a turbine inlet or heat addition point, though it's on the lower end for achieving high efficiency in conventional gas turbines (which often target 800–1200°C for better performance). </w:t>
+      </w:r>
+      <w:proofErr w:type="gramStart"/>
+      <w:r>
+        <w:t>Below,</w:t>
+      </w:r>
+      <w:proofErr w:type="gramEnd"/>
+      <w:r>
+        <w:t xml:space="preserve"> </w:t>
+      </w:r>
+      <w:r>
+        <w:t>is</w:t>
+      </w:r>
+      <w:r>
+        <w:t xml:space="preserve"> explain</w:t>
+      </w:r>
+      <w:r>
+        <w:t>ed</w:t>
+      </w:r>
+      <w:r>
+        <w:t xml:space="preserve"> the context, feasibility, and key considerations for each fluid.</w:t>
+      </w:r>
+    </w:p>
+    <w:p>
+      <w:pPr>
+        <w:numPr>
+          <w:ilvl w:val="0"/>
+          <w:numId w:val="23"/>
+        </w:numPr>
+        <w:rPr>
+          <w:b/>
+          <w:bCs/>
+        </w:rPr>
+      </w:pPr>
+      <w:r>
+        <w:rPr>
+          <w:b/>
+          <w:bCs/>
+        </w:rPr>
+        <w:t>General Feasibility in Brayton Cycles</w:t>
+      </w:r>
+    </w:p>
+    <w:p>
+      <w:pPr>
+        <w:numPr>
+          <w:ilvl w:val="0"/>
+          <w:numId w:val="23"/>
+        </w:numPr>
+      </w:pPr>
+      <w:r>
+        <w:t>The Brayton cycle involves isentropic compression, constant-pressure heat addition, isentropic expansion, and constant-pressure heat rejection. Air is the standard working fluid in open cycles (e.g., jet engines), but closed cycles allow alternatives like N₂ or CO₂ for specialized applications such as power generation, cryocoolers, or nuclear reactors.</w:t>
+      </w:r>
+    </w:p>
+    <w:p>
+      <w:pPr>
+        <w:numPr>
+          <w:ilvl w:val="0"/>
+          <w:numId w:val="23"/>
+        </w:numPr>
+      </w:pPr>
+      <w:r>
+        <w:t>At 400°C, both gases remain stable and gaseous (no phase change issues under typical pressures). However, cycle efficiency (η) depends on the pressure ratio (</w:t>
+      </w:r>
+      <w:proofErr w:type="spellStart"/>
+      <w:r>
+        <w:t>r_p</w:t>
+      </w:r>
+      <w:proofErr w:type="spellEnd"/>
+      <w:r>
+        <w:t xml:space="preserve"> = </w:t>
+      </w:r>
+      <w:proofErr w:type="spellStart"/>
+      <w:r>
+        <w:t>P_high</w:t>
+      </w:r>
+      <w:proofErr w:type="spellEnd"/>
+      <w:r>
+        <w:t xml:space="preserve"> / </w:t>
+      </w:r>
+      <w:proofErr w:type="spellStart"/>
+      <w:r>
+        <w:t>P_low</w:t>
+      </w:r>
+      <w:proofErr w:type="spellEnd"/>
+      <w:r>
+        <w:t>) and maximum temperature (T_max), roughly η ≈ 1 - (1/</w:t>
+      </w:r>
+      <w:proofErr w:type="spellStart"/>
+      <w:r>
+        <w:t>r_p</w:t>
+      </w:r>
+      <w:proofErr w:type="spellEnd"/>
+      <w:r>
+        <w:t>)^((γ-1)/γ), where γ is the specific heat ratio (≈1.4 for diatomic gases like N₂, ≈1.3 for CO₂).</w:t>
+      </w:r>
+    </w:p>
+    <w:p>
+      <w:pPr>
+        <w:numPr>
+          <w:ilvl w:val="0"/>
+          <w:numId w:val="23"/>
+        </w:numPr>
+      </w:pPr>
+      <w:r>
+        <w:t xml:space="preserve">Lower T_max like 400°C yields efficiencies around 20–40% (depending on </w:t>
+      </w:r>
+      <w:proofErr w:type="spellStart"/>
+      <w:r>
+        <w:t>r_p</w:t>
+      </w:r>
+      <w:proofErr w:type="spellEnd"/>
+      <w:r>
+        <w:t xml:space="preserve"> = 5–20), compared to 50–60% at higher temperatures. This makes it suitable for low-grade heat sources (e.g., geothermal, waste heat recovery) but less ideal for high-power applications.</w:t>
+      </w:r>
+    </w:p>
+    <w:p>
+      <w:pPr>
+        <w:numPr>
+          <w:ilvl w:val="0"/>
+          <w:numId w:val="23"/>
+        </w:numPr>
+        <w:rPr>
+          <w:b/>
+          <w:bCs/>
+        </w:rPr>
+      </w:pPr>
+      <w:r>
+        <w:rPr>
+          <w:b/>
+          <w:bCs/>
+        </w:rPr>
+        <w:t>Using Nitrogen (N₂) at 400°C</w:t>
+      </w:r>
+    </w:p>
+    <w:p>
+      <w:pPr>
+        <w:numPr>
+          <w:ilvl w:val="0"/>
+          <w:numId w:val="23"/>
+        </w:numPr>
+      </w:pPr>
+      <w:r>
+        <w:rPr>
+          <w:b/>
+          <w:bCs/>
+        </w:rPr>
+        <w:t>Feasibility</w:t>
+      </w:r>
+      <w:r>
+        <w:t>:  N₂ is commonly used in closed Brayton cycles, especially for cryogenic cooling (reverse Brayton) or nuclear applications like sodium-cooled fast reactors (SFRs). It's inert, non-reactive with sodium coolants, eco-friendly, and safe. Examples include prototypes tested at pressures of 8–18 bar and temperatures down to -140°C on the cold side, but it scales to higher temps like 400°C.</w:t>
+      </w:r>
+    </w:p>
+    <w:p>
+      <w:pPr>
+        <w:numPr>
+          <w:ilvl w:val="0"/>
+          <w:numId w:val="23"/>
+        </w:numPr>
+      </w:pPr>
+      <w:r>
+        <w:rPr>
+          <w:b/>
+          <w:bCs/>
+        </w:rPr>
+        <w:t>Advantages</w:t>
+      </w:r>
+      <w:r>
+        <w:t>:</w:t>
+      </w:r>
+    </w:p>
+    <w:p>
+      <w:pPr>
+        <w:numPr>
+          <w:ilvl w:val="0"/>
+          <w:numId w:val="23"/>
+        </w:numPr>
+      </w:pPr>
+      <w:r>
+        <w:t>High stability at 400°C (no decomposition).</w:t>
+      </w:r>
+    </w:p>
+    <w:p>
+      <w:pPr>
+        <w:numPr>
+          <w:ilvl w:val="0"/>
+          <w:numId w:val="23"/>
+        </w:numPr>
+      </w:pPr>
+      <w:r>
+        <w:t>Good thermodynamic properties: γ ≈ 1.4, specific heat (</w:t>
+      </w:r>
+      <w:proofErr w:type="spellStart"/>
+      <w:r>
+        <w:t>c_p</w:t>
+      </w:r>
+      <w:proofErr w:type="spellEnd"/>
+      <w:r>
+        <w:t>) ≈ 1.04 kJ/</w:t>
+      </w:r>
+      <w:proofErr w:type="spellStart"/>
+      <w:r>
+        <w:t>kg·K</w:t>
+      </w:r>
+      <w:proofErr w:type="spellEnd"/>
+      <w:r>
+        <w:t>.</w:t>
+      </w:r>
+    </w:p>
+    <w:p>
+      <w:pPr>
+        <w:numPr>
+          <w:ilvl w:val="0"/>
+          <w:numId w:val="23"/>
+        </w:numPr>
+      </w:pPr>
+      <w:r>
+        <w:t>Used in intercooled or regenerative cycles for efficiency gains.</w:t>
+      </w:r>
+    </w:p>
+    <w:p>
+      <w:pPr>
+        <w:numPr>
+          <w:ilvl w:val="0"/>
+          <w:numId w:val="23"/>
+        </w:numPr>
+      </w:pPr>
+      <w:r>
+        <w:rPr>
+          <w:b/>
+          <w:bCs/>
+        </w:rPr>
+        <w:lastRenderedPageBreak/>
+        <w:t>Applications and Examples</w:t>
+      </w:r>
+      <w:r>
+        <w:t>:</w:t>
+      </w:r>
+    </w:p>
+    <w:p>
+      <w:pPr>
+        <w:numPr>
+          <w:ilvl w:val="0"/>
+          <w:numId w:val="23"/>
+        </w:numPr>
+      </w:pPr>
+      <w:r>
+        <w:t>Cryocoolers: N₂ Brayton prototypes achieve cooling effects of 15–20 kW with coefficients of performance (COP) up to 1.34 (including waste heat recovery).</w:t>
+      </w:r>
+    </w:p>
+    <w:p>
+      <w:pPr>
+        <w:numPr>
+          <w:ilvl w:val="0"/>
+          <w:numId w:val="23"/>
+        </w:numPr>
+      </w:pPr>
+      <w:r>
+        <w:t xml:space="preserve">Nuclear: Coupled to small modular SFRs (e.g., 500 </w:t>
+      </w:r>
+      <w:proofErr w:type="spellStart"/>
+      <w:r>
+        <w:t>MWth</w:t>
+      </w:r>
+      <w:proofErr w:type="spellEnd"/>
+      <w:r>
+        <w:t>) for power generation, with turbine inlet temps around 400–600°C.</w:t>
+      </w:r>
+    </w:p>
+    <w:p>
+      <w:pPr>
+        <w:numPr>
+          <w:ilvl w:val="0"/>
+          <w:numId w:val="23"/>
+        </w:numPr>
+      </w:pPr>
+      <w:r>
+        <w:t>Reacting variants: N₂ tetroxide (N₂O₄) has been studied for performance boosts in closed cycles.</w:t>
+      </w:r>
+    </w:p>
+    <w:p>
+      <w:pPr>
+        <w:numPr>
+          <w:ilvl w:val="0"/>
+          <w:numId w:val="23"/>
+        </w:numPr>
+      </w:pPr>
+      <w:r>
+        <w:rPr>
+          <w:b/>
+          <w:bCs/>
+        </w:rPr>
+        <w:t>Challenges</w:t>
+      </w:r>
+      <w:r>
+        <w:t>: Lower efficiency at 400°C unless paired with high pressure ratios or regeneration. Not ideal for open cycles due to sourcing/purity needs.</w:t>
+      </w:r>
+    </w:p>
+    <w:p>
+      <w:pPr>
+        <w:numPr>
+          <w:ilvl w:val="0"/>
+          <w:numId w:val="23"/>
+        </w:numPr>
+        <w:rPr>
+          <w:b/>
+          <w:bCs/>
+        </w:rPr>
+      </w:pPr>
+      <w:r>
+        <w:rPr>
+          <w:b/>
+          <w:bCs/>
+        </w:rPr>
+        <w:t>Using Carbon Dioxide (CO₂) at 400°C</w:t>
+      </w:r>
+    </w:p>
+    <w:p>
+      <w:pPr>
+        <w:numPr>
+          <w:ilvl w:val="0"/>
+          <w:numId w:val="23"/>
+        </w:numPr>
+      </w:pPr>
+      <w:r>
+        <w:rPr>
+          <w:b/>
+          <w:bCs/>
+        </w:rPr>
+        <w:t>Feasibility</w:t>
+      </w:r>
+      <w:r>
+        <w:t>: Yes, especially in supercritical CO₂ (</w:t>
+      </w:r>
+      <w:proofErr w:type="spellStart"/>
+      <w:r>
+        <w:t>sCO</w:t>
+      </w:r>
+      <w:proofErr w:type="spellEnd"/>
+      <w:r>
+        <w:t>₂) Brayton cycles, where CO₂ operates above its critical point (31°C, 73.8 bar) for compact, efficient designs. At 400°C and high pressures, it's supercritical, behaving like a dense gas with excellent heat transfer. Pure CO₂ or mixtures (e.g., with Kr, Xe, CH₄) are researched for this.</w:t>
+      </w:r>
+    </w:p>
+    <w:p>
+      <w:pPr>
+        <w:numPr>
+          <w:ilvl w:val="0"/>
+          <w:numId w:val="23"/>
+        </w:numPr>
+      </w:pPr>
+      <w:r>
+        <w:rPr>
+          <w:b/>
+          <w:bCs/>
+        </w:rPr>
+        <w:t>Advantages</w:t>
+      </w:r>
+      <w:r>
+        <w:t>:</w:t>
+      </w:r>
+    </w:p>
+    <w:p>
+      <w:pPr>
+        <w:numPr>
+          <w:ilvl w:val="0"/>
+          <w:numId w:val="23"/>
+        </w:numPr>
+      </w:pPr>
+      <w:r>
+        <w:t>High density in supercritical state reduces component sizes (e.g., turbines 10x smaller than steam equivalents).</w:t>
+      </w:r>
+    </w:p>
+    <w:p>
+      <w:pPr>
+        <w:numPr>
+          <w:ilvl w:val="0"/>
+          <w:numId w:val="23"/>
+        </w:numPr>
+      </w:pPr>
+      <w:r>
+        <w:t xml:space="preserve">γ ≈ 1.3, </w:t>
+      </w:r>
+      <w:proofErr w:type="spellStart"/>
+      <w:r>
+        <w:t>c_p</w:t>
+      </w:r>
+      <w:proofErr w:type="spellEnd"/>
+      <w:r>
+        <w:t xml:space="preserve"> ≈ 0.85–1.2 kJ/</w:t>
+      </w:r>
+      <w:proofErr w:type="spellStart"/>
+      <w:r>
+        <w:t>kg·K</w:t>
+      </w:r>
+      <w:proofErr w:type="spellEnd"/>
+      <w:r>
+        <w:t xml:space="preserve"> (varies with state).</w:t>
+      </w:r>
+    </w:p>
+    <w:p>
+      <w:pPr>
+        <w:numPr>
+          <w:ilvl w:val="0"/>
+          <w:numId w:val="23"/>
+        </w:numPr>
+      </w:pPr>
+      <w:r>
+        <w:t xml:space="preserve">Efficiency improvements: </w:t>
+      </w:r>
+      <w:proofErr w:type="spellStart"/>
+      <w:r>
+        <w:t>sCO</w:t>
+      </w:r>
+      <w:proofErr w:type="spellEnd"/>
+      <w:r>
+        <w:t>₂ cycles can reach 40–50% efficiency at 400–700°C, outperforming steam Rankine cycles.</w:t>
+      </w:r>
+    </w:p>
+    <w:p>
+      <w:pPr>
+        <w:numPr>
+          <w:ilvl w:val="0"/>
+          <w:numId w:val="23"/>
+        </w:numPr>
+      </w:pPr>
+      <w:r>
+        <w:rPr>
+          <w:b/>
+          <w:bCs/>
+        </w:rPr>
+        <w:t>Applications and Examples</w:t>
+      </w:r>
+      <w:r>
+        <w:t>:</w:t>
+      </w:r>
+    </w:p>
+    <w:p>
+      <w:pPr>
+        <w:numPr>
+          <w:ilvl w:val="0"/>
+          <w:numId w:val="23"/>
+        </w:numPr>
+      </w:pPr>
+      <w:r>
+        <w:t xml:space="preserve">Power generation: Used in recompression Brayton cycles (RCBC) for fossil, solar, geothermal, or nuclear plants. Sandia Labs demonstrated 10 kW </w:t>
+      </w:r>
+      <w:proofErr w:type="spellStart"/>
+      <w:r>
+        <w:t>sCO</w:t>
+      </w:r>
+      <w:proofErr w:type="spellEnd"/>
+      <w:r>
+        <w:t>₂ cycles; larger 10 MWe pilots (e.g., STEP Demo) operate at similar temps.</w:t>
+      </w:r>
+    </w:p>
+    <w:p>
+      <w:pPr>
+        <w:numPr>
+          <w:ilvl w:val="0"/>
+          <w:numId w:val="23"/>
+        </w:numPr>
+      </w:pPr>
+      <w:r>
+        <w:t>Geothermal/Waste Heat: CO₂ mixtures (e.g., CO₂/CH₄) suit low-temps (200–500°C), boosting efficiency by 3–10% over pure CO₂.</w:t>
+      </w:r>
+    </w:p>
+    <w:p>
+      <w:pPr>
+        <w:numPr>
+          <w:ilvl w:val="0"/>
+          <w:numId w:val="23"/>
+        </w:numPr>
+      </w:pPr>
+      <w:r>
+        <w:t>Storage/Advanced: In Allam-</w:t>
+      </w:r>
+      <w:proofErr w:type="spellStart"/>
+      <w:r>
+        <w:t>Fetvedt</w:t>
+      </w:r>
+      <w:proofErr w:type="spellEnd"/>
+      <w:r>
+        <w:t xml:space="preserve"> cycles for oxyfuel combustion or pumped thermal energy storage.</w:t>
+      </w:r>
+    </w:p>
+    <w:p>
+      <w:pPr>
+        <w:numPr>
+          <w:ilvl w:val="0"/>
+          <w:numId w:val="23"/>
+        </w:numPr>
+      </w:pPr>
+      <w:r>
+        <w:rPr>
+          <w:b/>
+          <w:bCs/>
+        </w:rPr>
+        <w:t>Challenges</w:t>
+      </w:r>
+      <w:r>
+        <w:t xml:space="preserve">: Requires high pressures (100–300 bar) for supercritical benefits. At subzero </w:t>
+      </w:r>
+      <w:proofErr w:type="spellStart"/>
+      <w:r>
+        <w:t>ambients</w:t>
+      </w:r>
+      <w:proofErr w:type="spellEnd"/>
+      <w:r>
+        <w:t xml:space="preserve">, mixtures help avoid two-phase issues. Corrosion potential in some </w:t>
+      </w:r>
+      <w:proofErr w:type="gramStart"/>
+      <w:r>
+        <w:t>setups, but</w:t>
+      </w:r>
+      <w:proofErr w:type="gramEnd"/>
+      <w:r>
+        <w:t xml:space="preserve"> mitigated with materials like nickel alloys.</w:t>
+      </w:r>
+    </w:p>
+    <w:p>
+      <w:pPr>
+        <w:numPr>
+          <w:ilvl w:val="0"/>
+          <w:numId w:val="23"/>
+        </w:numPr>
+        <w:rPr>
+          <w:b/>
+          <w:bCs/>
+        </w:rPr>
+      </w:pPr>
+      <w:r>
+        <w:rPr>
+          <w:b/>
+          <w:bCs/>
+        </w:rPr>
+        <w:lastRenderedPageBreak/>
+        <w:t>Comparison</w:t>
+      </w:r>
+    </w:p>
+    <w:p>
+      <w:pPr>
+        <w:numPr>
+          <w:ilvl w:val="0"/>
+          <w:numId w:val="23"/>
+        </w:numPr>
+      </w:pPr>
+      <w:r>
+        <w:rPr>
+          <w:noProof/>
+        </w:rPr>
+        <w:drawing>
+          <wp:inline distT="0" distB="0" distL="0" distR="0" wp14:anchorId="1C4DC331" wp14:editId="28B1FE51">
+            <wp:extent cx="5943600" cy="2031365"/>
+            <wp:effectExtent l="0" t="0" r="0" b="6985"/>
+            <wp:docPr id="1498729084" name="Picture 1"/>
+            <wp:cNvGraphicFramePr>
+              <a:graphicFrameLocks xmlns:a="http://schemas.openxmlformats.org/drawingml/2006/main" noChangeAspect="1"/>
+            </wp:cNvGraphicFramePr>
+            <a:graphic xmlns:a="http://schemas.openxmlformats.org/drawingml/2006/main">
+              <a:graphicData uri="http://schemas.openxmlformats.org/drawingml/2006/picture">
+                <pic:pic xmlns:pic="http://schemas.openxmlformats.org/drawingml/2006/picture">
+                  <pic:nvPicPr>
+                    <pic:cNvPr id="1498729084" name=""/>
+                    <pic:cNvPicPr/>
+                  </pic:nvPicPr>
+                  <pic:blipFill>
+                    <a:blip r:embed="rId12"/>
+                    <a:stretch>
+                      <a:fillRect/>
+                    </a:stretch>
+                  </pic:blipFill>
+                  <pic:spPr>
+                    <a:xfrm>
+                      <a:off x="0" y="0"/>
+                      <a:ext cx="5943600" cy="2031365"/>
+                    </a:xfrm>
+                    <a:prstGeom prst="rect">
+                      <a:avLst/>
+                    </a:prstGeom>
+                  </pic:spPr>
+                </pic:pic>
+              </a:graphicData>
+            </a:graphic>
+          </wp:inline>
+        </w:drawing>
+      </w:r>
+    </w:p>
+    <w:p>
+      <w:pPr>
+        <w:pStyle w:val="ListParagraph"/>
+        <w:spacing w:before="100" w:beforeAutospacing="1" w:after="100" w:afterAutospacing="1" w:line="240" w:lineRule="auto"/>
+        <w:rPr>
+          <w:rFonts w:ascii="Times New Roman" w:eastAsia="Times New Roman" w:hAnsi="Times New Roman" w:cs="Times New Roman"/>
+          <w:kern w:val="0"/>
+          <w14:ligatures w14:val="none"/>
+        </w:rPr>
+      </w:pPr>
+      <w:r>
+        <w:rPr>
+          <w:rFonts w:ascii="Times New Roman" w:eastAsia="Times New Roman" w:hAnsi="Times New Roman" w:cs="Times New Roman"/>
+          <w:kern w:val="0"/>
+          <w14:ligatures w14:val="none"/>
+        </w:rPr>
+        <w:t xml:space="preserve">In summary, both are viable, but CO₂ (especially </w:t>
+      </w:r>
+      <w:proofErr w:type="spellStart"/>
+      <w:r>
+        <w:rPr>
+          <w:rFonts w:ascii="Times New Roman" w:eastAsia="Times New Roman" w:hAnsi="Times New Roman" w:cs="Times New Roman"/>
+          <w:kern w:val="0"/>
+          <w14:ligatures w14:val="none"/>
+        </w:rPr>
+        <w:t>sCO</w:t>
+      </w:r>
+      <w:proofErr w:type="spellEnd"/>
+      <w:r>
+        <w:rPr>
+          <w:rFonts w:ascii="Times New Roman" w:eastAsia="Times New Roman" w:hAnsi="Times New Roman" w:cs="Times New Roman"/>
+          <w:kern w:val="0"/>
+          <w14:ligatures w14:val="none"/>
+        </w:rPr>
+        <w:t>₂) is more actively researched for efficiency and compactness in modern applications</w:t>
+      </w:r>
+      <w:r>
+        <w:rPr>
+          <w:rFonts w:ascii="Times New Roman" w:eastAsia="Times New Roman" w:hAnsi="Times New Roman" w:cs="Times New Roman"/>
+          <w:kern w:val="0"/>
+          <w14:ligatures w14:val="none"/>
+        </w:rPr>
+        <w:t>.</w:t>
+      </w:r>
+    </w:p>
+    <w:p>
+      <w:pPr>
+        <w:ind w:left="720"/>
+      </w:pPr>
     </w:p>
     <w:p/>
     <w:p/>
@@ -5315,6 +6646,155 @@
     </w:lvl>
   </w:abstractNum>
   <w:abstractNum w:abstractNumId="4" w15:restartNumberingAfterBreak="0">
+    <w:nsid w:val="252236D5"/>
+    <w:multiLevelType w:val="multilevel"/>
+    <w:tmpl w:val="9F62F8E8"/>
+    <w:lvl w:ilvl="0">
+      <w:start w:val="1"/>
+      <w:numFmt w:val="bullet"/>
+      <w:lvlText w:val=""/>
+      <w:lvlJc w:val="left"/>
+      <w:pPr>
+        <w:tabs>
+          <w:tab w:val="num" w:pos="720"/>
+        </w:tabs>
+        <w:ind w:left="720" w:hanging="360"/>
+      </w:pPr>
+      <w:rPr>
+        <w:rFonts w:ascii="Symbol" w:hAnsi="Symbol" w:hint="default"/>
+        <w:sz w:val="20"/>
+      </w:rPr>
+    </w:lvl>
+    <w:lvl w:ilvl="1" w:tentative="1">
+      <w:start w:val="1"/>
+      <w:numFmt w:val="bullet"/>
+      <w:lvlText w:val="o"/>
+      <w:lvlJc w:val="left"/>
+      <w:pPr>
+        <w:tabs>
+          <w:tab w:val="num" w:pos="1440"/>
+        </w:tabs>
+        <w:ind w:left="1440" w:hanging="360"/>
+      </w:pPr>
+      <w:rPr>
+        <w:rFonts w:ascii="Courier New" w:hAnsi="Courier New" w:hint="default"/>
+        <w:sz w:val="20"/>
+      </w:rPr>
+    </w:lvl>
+    <w:lvl w:ilvl="2" w:tentative="1">
+      <w:start w:val="1"/>
+      <w:numFmt w:val="bullet"/>
+      <w:lvlText w:val=""/>
+      <w:lvlJc w:val="left"/>
+      <w:pPr>
+        <w:tabs>
+          <w:tab w:val="num" w:pos="2160"/>
+        </w:tabs>
+        <w:ind w:left="2160" w:hanging="360"/>
+      </w:pPr>
+      <w:rPr>
+        <w:rFonts w:ascii="Wingdings" w:hAnsi="Wingdings" w:hint="default"/>
+        <w:sz w:val="20"/>
+      </w:rPr>
+    </w:lvl>
+    <w:lvl w:ilvl="3" w:tentative="1">
+      <w:start w:val="1"/>
+      <w:numFmt w:val="bullet"/>
+      <w:lvlText w:val=""/>
+      <w:lvlJc w:val="left"/>
+      <w:pPr>
+        <w:tabs>
+          <w:tab w:val="num" w:pos="2880"/>
+        </w:tabs>
+        <w:ind w:left="2880" w:hanging="360"/>
+      </w:pPr>
+      <w:rPr>
+        <w:rFonts w:ascii="Wingdings" w:hAnsi="Wingdings" w:hint="default"/>
+        <w:sz w:val="20"/>
+      </w:rPr>
+    </w:lvl>
+    <w:lvl w:ilvl="4" w:tentative="1">
+      <w:start w:val="1"/>
+      <w:numFmt w:val="bullet"/>
+      <w:lvlText w:val=""/>
+      <w:lvlJc w:val="left"/>
+      <w:pPr>
+        <w:tabs>
+          <w:tab w:val="num" w:pos="3600"/>
+        </w:tabs>
+        <w:ind w:left="3600" w:hanging="360"/>
+      </w:pPr>
+      <w:rPr>
+        <w:rFonts w:ascii="Wingdings" w:hAnsi="Wingdings" w:hint="default"/>
+        <w:sz w:val="20"/>
+      </w:rPr>
+    </w:lvl>
+    <w:lvl w:ilvl="5" w:tentative="1">
+      <w:start w:val="1"/>
+      <w:numFmt w:val="bullet"/>
+      <w:lvlText w:val=""/>
+      <w:lvlJc w:val="left"/>
+      <w:pPr>
+        <w:tabs>
+          <w:tab w:val="num" w:pos="4320"/>
+        </w:tabs>
+        <w:ind w:left="4320" w:hanging="360"/>
+      </w:pPr>
+      <w:rPr>
+        <w:rFonts w:ascii="Wingdings" w:hAnsi="Wingdings" w:hint="default"/>
+        <w:sz w:val="20"/>
+      </w:rPr>
+    </w:lvl>
+    <w:lvl w:ilvl="6" w:tentative="1">
+      <w:start w:val="1"/>
+      <w:numFmt w:val="bullet"/>
+      <w:lvlText w:val=""/>
+      <w:lvlJc w:val="left"/>
+      <w:pPr>
+        <w:tabs>
+          <w:tab w:val="num" w:pos="5040"/>
+        </w:tabs>
+        <w:ind w:left="5040" w:hanging="360"/>
+      </w:pPr>
+      <w:rPr>
+        <w:rFonts w:ascii="Wingdings" w:hAnsi="Wingdings" w:hint="default"/>
+        <w:sz w:val="20"/>
+      </w:rPr>
+    </w:lvl>
+    <w:lvl w:ilvl="7" w:tentative="1">
+      <w:start w:val="1"/>
+      <w:numFmt w:val="bullet"/>
+      <w:lvlText w:val=""/>
+      <w:lvlJc w:val="left"/>
+      <w:pPr>
+        <w:tabs>
+          <w:tab w:val="num" w:pos="5760"/>
+        </w:tabs>
+        <w:ind w:left="5760" w:hanging="360"/>
+      </w:pPr>
+      <w:rPr>
+        <w:rFonts w:ascii="Wingdings" w:hAnsi="Wingdings" w:hint="default"/>
+        <w:sz w:val="20"/>
+      </w:rPr>
+    </w:lvl>
+    <w:lvl w:ilvl="8" w:tentative="1">
+      <w:start w:val="1"/>
+      <w:numFmt w:val="bullet"/>
+      <w:lvlText w:val=""/>
+      <w:lvlJc w:val="left"/>
+      <w:pPr>
+        <w:tabs>
+          <w:tab w:val="num" w:pos="6480"/>
+        </w:tabs>
+        <w:ind w:left="6480" w:hanging="360"/>
+      </w:pPr>
+      <w:rPr>
+        <w:rFonts w:ascii="Wingdings" w:hAnsi="Wingdings" w:hint="default"/>
+        <w:sz w:val="20"/>
+      </w:rPr>
+    </w:lvl>
+  </w:abstractNum>
+  <w:abstractNum w:abstractNumId="5" w15:restartNumberingAfterBreak="0">
     <w:nsid w:val="2E5B2305"/>
     <w:multiLevelType w:val="multilevel"/>
     <w:tmpl w:val="476A2378"/>
@@ -5463,7 +6943,7 @@
       </w:rPr>
     </w:lvl>
   </w:abstractNum>
-  <w:abstractNum w:abstractNumId="5" w15:restartNumberingAfterBreak="0">
+  <w:abstractNum w:abstractNumId="6" w15:restartNumberingAfterBreak="0">
     <w:nsid w:val="34A60DF0"/>
     <w:multiLevelType w:val="multilevel"/>
     <w:tmpl w:val="BEA8B324"/>
@@ -5612,7 +7092,7 @@
       </w:rPr>
     </w:lvl>
   </w:abstractNum>
-  <w:abstractNum w:abstractNumId="6" w15:restartNumberingAfterBreak="0">
+  <w:abstractNum w:abstractNumId="7" w15:restartNumberingAfterBreak="0">
     <w:nsid w:val="36837986"/>
     <w:multiLevelType w:val="multilevel"/>
     <w:tmpl w:val="C7FC81D6"/>
@@ -5761,7 +7241,7 @@
       </w:rPr>
     </w:lvl>
   </w:abstractNum>
-  <w:abstractNum w:abstractNumId="7" w15:restartNumberingAfterBreak="0">
+  <w:abstractNum w:abstractNumId="8" w15:restartNumberingAfterBreak="0">
     <w:nsid w:val="38A25DCF"/>
     <w:multiLevelType w:val="multilevel"/>
     <w:tmpl w:val="397CDBFC"/>
@@ -5910,7 +7390,7 @@
       </w:rPr>
     </w:lvl>
   </w:abstractNum>
-  <w:abstractNum w:abstractNumId="8" w15:restartNumberingAfterBreak="0">
+  <w:abstractNum w:abstractNumId="9" w15:restartNumberingAfterBreak="0">
     <w:nsid w:val="38F606C5"/>
     <w:multiLevelType w:val="multilevel"/>
     <w:tmpl w:val="E872DA40"/>
@@ -6059,7 +7539,7 @@
       </w:rPr>
     </w:lvl>
   </w:abstractNum>
-  <w:abstractNum w:abstractNumId="9" w15:restartNumberingAfterBreak="0">
+  <w:abstractNum w:abstractNumId="10" w15:restartNumberingAfterBreak="0">
     <w:nsid w:val="460A2CC7"/>
     <w:multiLevelType w:val="multilevel"/>
     <w:tmpl w:val="04801F38"/>
@@ -6208,7 +7688,156 @@
       </w:rPr>
     </w:lvl>
   </w:abstractNum>
-  <w:abstractNum w:abstractNumId="10" w15:restartNumberingAfterBreak="0">
+  <w:abstractNum w:abstractNumId="11" w15:restartNumberingAfterBreak="0">
+    <w:nsid w:val="46BF485A"/>
+    <w:multiLevelType w:val="multilevel"/>
+    <w:tmpl w:val="CD0CC722"/>
+    <w:lvl w:ilvl="0">
+      <w:start w:val="1"/>
+      <w:numFmt w:val="bullet"/>
+      <w:lvlText w:val=""/>
+      <w:lvlJc w:val="left"/>
+      <w:pPr>
+        <w:tabs>
+          <w:tab w:val="num" w:pos="720"/>
+        </w:tabs>
+        <w:ind w:left="720" w:hanging="360"/>
+      </w:pPr>
+      <w:rPr>
+        <w:rFonts w:ascii="Symbol" w:hAnsi="Symbol" w:hint="default"/>
+        <w:sz w:val="20"/>
+      </w:rPr>
+    </w:lvl>
+    <w:lvl w:ilvl="1">
+      <w:start w:val="1"/>
+      <w:numFmt w:val="bullet"/>
+      <w:lvlText w:val="o"/>
+      <w:lvlJc w:val="left"/>
+      <w:pPr>
+        <w:tabs>
+          <w:tab w:val="num" w:pos="1440"/>
+        </w:tabs>
+        <w:ind w:left="1440" w:hanging="360"/>
+      </w:pPr>
+      <w:rPr>
+        <w:rFonts w:ascii="Courier New" w:hAnsi="Courier New" w:hint="default"/>
+        <w:sz w:val="20"/>
+      </w:rPr>
+    </w:lvl>
+    <w:lvl w:ilvl="2" w:tentative="1">
+      <w:start w:val="1"/>
+      <w:numFmt w:val="bullet"/>
+      <w:lvlText w:val=""/>
+      <w:lvlJc w:val="left"/>
+      <w:pPr>
+        <w:tabs>
+          <w:tab w:val="num" w:pos="2160"/>
+        </w:tabs>
+        <w:ind w:left="2160" w:hanging="360"/>
+      </w:pPr>
+      <w:rPr>
+        <w:rFonts w:ascii="Wingdings" w:hAnsi="Wingdings" w:hint="default"/>
+        <w:sz w:val="20"/>
+      </w:rPr>
+    </w:lvl>
+    <w:lvl w:ilvl="3" w:tentative="1">
+      <w:start w:val="1"/>
+      <w:numFmt w:val="bullet"/>
+      <w:lvlText w:val=""/>
+      <w:lvlJc w:val="left"/>
+      <w:pPr>
+        <w:tabs>
+          <w:tab w:val="num" w:pos="2880"/>
+        </w:tabs>
+        <w:ind w:left="2880" w:hanging="360"/>
+      </w:pPr>
+      <w:rPr>
+        <w:rFonts w:ascii="Wingdings" w:hAnsi="Wingdings" w:hint="default"/>
+        <w:sz w:val="20"/>
+      </w:rPr>
+    </w:lvl>
+    <w:lvl w:ilvl="4" w:tentative="1">
+      <w:start w:val="1"/>
+      <w:numFmt w:val="bullet"/>
+      <w:lvlText w:val=""/>
+      <w:lvlJc w:val="left"/>
+      <w:pPr>
+        <w:tabs>
+          <w:tab w:val="num" w:pos="3600"/>
+        </w:tabs>
+        <w:ind w:left="3600" w:hanging="360"/>
+      </w:pPr>
+      <w:rPr>
+        <w:rFonts w:ascii="Wingdings" w:hAnsi="Wingdings" w:hint="default"/>
+        <w:sz w:val="20"/>
+      </w:rPr>
+    </w:lvl>
+    <w:lvl w:ilvl="5" w:tentative="1">
+      <w:start w:val="1"/>
+      <w:numFmt w:val="bullet"/>
+      <w:lvlText w:val=""/>
+      <w:lvlJc w:val="left"/>
+      <w:pPr>
+        <w:tabs>
+          <w:tab w:val="num" w:pos="4320"/>
+        </w:tabs>
+        <w:ind w:left="4320" w:hanging="360"/>
+      </w:pPr>
+      <w:rPr>
+        <w:rFonts w:ascii="Wingdings" w:hAnsi="Wingdings" w:hint="default"/>
+        <w:sz w:val="20"/>
+      </w:rPr>
+    </w:lvl>
+    <w:lvl w:ilvl="6" w:tentative="1">
+      <w:start w:val="1"/>
+      <w:numFmt w:val="bullet"/>
+      <w:lvlText w:val=""/>
+      <w:lvlJc w:val="left"/>
+      <w:pPr>
+        <w:tabs>
+          <w:tab w:val="num" w:pos="5040"/>
+        </w:tabs>
+        <w:ind w:left="5040" w:hanging="360"/>
+      </w:pPr>
+      <w:rPr>
+        <w:rFonts w:ascii="Wingdings" w:hAnsi="Wingdings" w:hint="default"/>
+        <w:sz w:val="20"/>
+      </w:rPr>
+    </w:lvl>
+    <w:lvl w:ilvl="7" w:tentative="1">
+      <w:start w:val="1"/>
+      <w:numFmt w:val="bullet"/>
+      <w:lvlText w:val=""/>
+      <w:lvlJc w:val="left"/>
+      <w:pPr>
+        <w:tabs>
+          <w:tab w:val="num" w:pos="5760"/>
+        </w:tabs>
+        <w:ind w:left="5760" w:hanging="360"/>
+      </w:pPr>
+      <w:rPr>
+        <w:rFonts w:ascii="Wingdings" w:hAnsi="Wingdings" w:hint="default"/>
+        <w:sz w:val="20"/>
+      </w:rPr>
+    </w:lvl>
+    <w:lvl w:ilvl="8" w:tentative="1">
+      <w:start w:val="1"/>
+      <w:numFmt w:val="bullet"/>
+      <w:lvlText w:val=""/>
+      <w:lvlJc w:val="left"/>
+      <w:pPr>
+        <w:tabs>
+          <w:tab w:val="num" w:pos="6480"/>
+        </w:tabs>
+        <w:ind w:left="6480" w:hanging="360"/>
+      </w:pPr>
+      <w:rPr>
+        <w:rFonts w:ascii="Wingdings" w:hAnsi="Wingdings" w:hint="default"/>
+        <w:sz w:val="20"/>
+      </w:rPr>
+    </w:lvl>
+  </w:abstractNum>
+  <w:abstractNum w:abstractNumId="12" w15:restartNumberingAfterBreak="0">
     <w:nsid w:val="48AA658D"/>
     <w:multiLevelType w:val="multilevel"/>
     <w:tmpl w:val="303821CE"/>
@@ -6357,7 +7986,156 @@
       </w:rPr>
     </w:lvl>
   </w:abstractNum>
-  <w:abstractNum w:abstractNumId="11" w15:restartNumberingAfterBreak="0">
+  <w:abstractNum w:abstractNumId="13" w15:restartNumberingAfterBreak="0">
+    <w:nsid w:val="4C616D22"/>
+    <w:multiLevelType w:val="multilevel"/>
+    <w:tmpl w:val="E33CF88C"/>
+    <w:lvl w:ilvl="0">
+      <w:start w:val="1"/>
+      <w:numFmt w:val="bullet"/>
+      <w:lvlText w:val=""/>
+      <w:lvlJc w:val="left"/>
+      <w:pPr>
+        <w:tabs>
+          <w:tab w:val="num" w:pos="720"/>
+        </w:tabs>
+        <w:ind w:left="720" w:hanging="360"/>
+      </w:pPr>
+      <w:rPr>
+        <w:rFonts w:ascii="Symbol" w:hAnsi="Symbol" w:hint="default"/>
+        <w:sz w:val="20"/>
+      </w:rPr>
+    </w:lvl>
+    <w:lvl w:ilvl="1">
+      <w:start w:val="1"/>
+      <w:numFmt w:val="bullet"/>
+      <w:lvlText w:val="o"/>
+      <w:lvlJc w:val="left"/>
+      <w:pPr>
+        <w:tabs>
+          <w:tab w:val="num" w:pos="1440"/>
+        </w:tabs>
+        <w:ind w:left="1440" w:hanging="360"/>
+      </w:pPr>
+      <w:rPr>
+        <w:rFonts w:ascii="Courier New" w:hAnsi="Courier New" w:hint="default"/>
+        <w:sz w:val="20"/>
+      </w:rPr>
+    </w:lvl>
+    <w:lvl w:ilvl="2" w:tentative="1">
+      <w:start w:val="1"/>
+      <w:numFmt w:val="bullet"/>
+      <w:lvlText w:val=""/>
+      <w:lvlJc w:val="left"/>
+      <w:pPr>
+        <w:tabs>
+          <w:tab w:val="num" w:pos="2160"/>
+        </w:tabs>
+        <w:ind w:left="2160" w:hanging="360"/>
+      </w:pPr>
+      <w:rPr>
+        <w:rFonts w:ascii="Wingdings" w:hAnsi="Wingdings" w:hint="default"/>
+        <w:sz w:val="20"/>
+      </w:rPr>
+    </w:lvl>
+    <w:lvl w:ilvl="3" w:tentative="1">
+      <w:start w:val="1"/>
+      <w:numFmt w:val="bullet"/>
+      <w:lvlText w:val=""/>
+      <w:lvlJc w:val="left"/>
+      <w:pPr>
+        <w:tabs>
+          <w:tab w:val="num" w:pos="2880"/>
+        </w:tabs>
+        <w:ind w:left="2880" w:hanging="360"/>
+      </w:pPr>
+      <w:rPr>
+        <w:rFonts w:ascii="Wingdings" w:hAnsi="Wingdings" w:hint="default"/>
+        <w:sz w:val="20"/>
+      </w:rPr>
+    </w:lvl>
+    <w:lvl w:ilvl="4" w:tentative="1">
+      <w:start w:val="1"/>
+      <w:numFmt w:val="bullet"/>
+      <w:lvlText w:val=""/>
+      <w:lvlJc w:val="left"/>
+      <w:pPr>
+        <w:tabs>
+          <w:tab w:val="num" w:pos="3600"/>
+        </w:tabs>
+        <w:ind w:left="3600" w:hanging="360"/>
+      </w:pPr>
+      <w:rPr>
+        <w:rFonts w:ascii="Wingdings" w:hAnsi="Wingdings" w:hint="default"/>
+        <w:sz w:val="20"/>
+      </w:rPr>
+    </w:lvl>
+    <w:lvl w:ilvl="5" w:tentative="1">
+      <w:start w:val="1"/>
+      <w:numFmt w:val="bullet"/>
+      <w:lvlText w:val=""/>
+      <w:lvlJc w:val="left"/>
+      <w:pPr>
+        <w:tabs>
+          <w:tab w:val="num" w:pos="4320"/>
+        </w:tabs>
+        <w:ind w:left="4320" w:hanging="360"/>
+      </w:pPr>
+      <w:rPr>
+        <w:rFonts w:ascii="Wingdings" w:hAnsi="Wingdings" w:hint="default"/>
+        <w:sz w:val="20"/>
+      </w:rPr>
+    </w:lvl>
+    <w:lvl w:ilvl="6" w:tentative="1">
+      <w:start w:val="1"/>
+      <w:numFmt w:val="bullet"/>
+      <w:lvlText w:val=""/>
+      <w:lvlJc w:val="left"/>
+      <w:pPr>
+        <w:tabs>
+          <w:tab w:val="num" w:pos="5040"/>
+        </w:tabs>
+        <w:ind w:left="5040" w:hanging="360"/>
+      </w:pPr>
+      <w:rPr>
+        <w:rFonts w:ascii="Wingdings" w:hAnsi="Wingdings" w:hint="default"/>
+        <w:sz w:val="20"/>
+      </w:rPr>
+    </w:lvl>
+    <w:lvl w:ilvl="7" w:tentative="1">
+      <w:start w:val="1"/>
+      <w:numFmt w:val="bullet"/>
+      <w:lvlText w:val=""/>
+      <w:lvlJc w:val="left"/>
+      <w:pPr>
+        <w:tabs>
+          <w:tab w:val="num" w:pos="5760"/>
+        </w:tabs>
+        <w:ind w:left="5760" w:hanging="360"/>
+      </w:pPr>
+      <w:rPr>
+        <w:rFonts w:ascii="Wingdings" w:hAnsi="Wingdings" w:hint="default"/>
+        <w:sz w:val="20"/>
+      </w:rPr>
+    </w:lvl>
+    <w:lvl w:ilvl="8" w:tentative="1">
+      <w:start w:val="1"/>
+      <w:numFmt w:val="bullet"/>
+      <w:lvlText w:val=""/>
+      <w:lvlJc w:val="left"/>
+      <w:pPr>
+        <w:tabs>
+          <w:tab w:val="num" w:pos="6480"/>
+        </w:tabs>
+        <w:ind w:left="6480" w:hanging="360"/>
+      </w:pPr>
+      <w:rPr>
+        <w:rFonts w:ascii="Wingdings" w:hAnsi="Wingdings" w:hint="default"/>
+        <w:sz w:val="20"/>
+      </w:rPr>
+    </w:lvl>
+  </w:abstractNum>
+  <w:abstractNum w:abstractNumId="14" w15:restartNumberingAfterBreak="0">
     <w:nsid w:val="500C1B01"/>
     <w:multiLevelType w:val="multilevel"/>
     <w:tmpl w:val="60CA7A86"/>
@@ -6506,7 +8284,7 @@
       </w:rPr>
     </w:lvl>
   </w:abstractNum>
-  <w:abstractNum w:abstractNumId="12" w15:restartNumberingAfterBreak="0">
+  <w:abstractNum w:abstractNumId="15" w15:restartNumberingAfterBreak="0">
     <w:nsid w:val="521B1C4D"/>
     <w:multiLevelType w:val="multilevel"/>
     <w:tmpl w:val="E43214B8"/>
@@ -6619,7 +8397,7 @@
       </w:pPr>
     </w:lvl>
   </w:abstractNum>
-  <w:abstractNum w:abstractNumId="13" w15:restartNumberingAfterBreak="0">
+  <w:abstractNum w:abstractNumId="16" w15:restartNumberingAfterBreak="0">
     <w:nsid w:val="55F9099A"/>
     <w:multiLevelType w:val="multilevel"/>
     <w:tmpl w:val="2EAA9C0A"/>
@@ -6768,7 +8546,7 @@
       </w:rPr>
     </w:lvl>
   </w:abstractNum>
-  <w:abstractNum w:abstractNumId="14" w15:restartNumberingAfterBreak="0">
+  <w:abstractNum w:abstractNumId="17" w15:restartNumberingAfterBreak="0">
     <w:nsid w:val="560A0F3E"/>
     <w:multiLevelType w:val="multilevel"/>
     <w:tmpl w:val="BDB45386"/>
@@ -6881,7 +8659,156 @@
       </w:pPr>
     </w:lvl>
   </w:abstractNum>
-  <w:abstractNum w:abstractNumId="15" w15:restartNumberingAfterBreak="0">
+  <w:abstractNum w:abstractNumId="18" w15:restartNumberingAfterBreak="0">
+    <w:nsid w:val="5B8B1F47"/>
+    <w:multiLevelType w:val="multilevel"/>
+    <w:tmpl w:val="2F7CF24E"/>
+    <w:lvl w:ilvl="0">
+      <w:start w:val="1"/>
+      <w:numFmt w:val="bullet"/>
+      <w:lvlText w:val=""/>
+      <w:lvlJc w:val="left"/>
+      <w:pPr>
+        <w:tabs>
+          <w:tab w:val="num" w:pos="720"/>
+        </w:tabs>
+        <w:ind w:left="720" w:hanging="360"/>
+      </w:pPr>
+      <w:rPr>
+        <w:rFonts w:ascii="Symbol" w:hAnsi="Symbol" w:hint="default"/>
+        <w:sz w:val="20"/>
+      </w:rPr>
+    </w:lvl>
+    <w:lvl w:ilvl="1">
+      <w:start w:val="1"/>
+      <w:numFmt w:val="bullet"/>
+      <w:lvlText w:val="o"/>
+      <w:lvlJc w:val="left"/>
+      <w:pPr>
+        <w:tabs>
+          <w:tab w:val="num" w:pos="1440"/>
+        </w:tabs>
+        <w:ind w:left="1440" w:hanging="360"/>
+      </w:pPr>
+      <w:rPr>
+        <w:rFonts w:ascii="Courier New" w:hAnsi="Courier New" w:hint="default"/>
+        <w:sz w:val="20"/>
+      </w:rPr>
+    </w:lvl>
+    <w:lvl w:ilvl="2" w:tentative="1">
+      <w:start w:val="1"/>
+      <w:numFmt w:val="bullet"/>
+      <w:lvlText w:val=""/>
+      <w:lvlJc w:val="left"/>
+      <w:pPr>
+        <w:tabs>
+          <w:tab w:val="num" w:pos="2160"/>
+        </w:tabs>
+        <w:ind w:left="2160" w:hanging="360"/>
+      </w:pPr>
+      <w:rPr>
+        <w:rFonts w:ascii="Wingdings" w:hAnsi="Wingdings" w:hint="default"/>
+        <w:sz w:val="20"/>
+      </w:rPr>
+    </w:lvl>
+    <w:lvl w:ilvl="3" w:tentative="1">
+      <w:start w:val="1"/>
+      <w:numFmt w:val="bullet"/>
+      <w:lvlText w:val=""/>
+      <w:lvlJc w:val="left"/>
+      <w:pPr>
+        <w:tabs>
+          <w:tab w:val="num" w:pos="2880"/>
+        </w:tabs>
+        <w:ind w:left="2880" w:hanging="360"/>
+      </w:pPr>
+      <w:rPr>
+        <w:rFonts w:ascii="Wingdings" w:hAnsi="Wingdings" w:hint="default"/>
+        <w:sz w:val="20"/>
+      </w:rPr>
+    </w:lvl>
+    <w:lvl w:ilvl="4" w:tentative="1">
+      <w:start w:val="1"/>
+      <w:numFmt w:val="bullet"/>
+      <w:lvlText w:val=""/>
+      <w:lvlJc w:val="left"/>
+      <w:pPr>
+        <w:tabs>
+          <w:tab w:val="num" w:pos="3600"/>
+        </w:tabs>
+        <w:ind w:left="3600" w:hanging="360"/>
+      </w:pPr>
+      <w:rPr>
+        <w:rFonts w:ascii="Wingdings" w:hAnsi="Wingdings" w:hint="default"/>
+        <w:sz w:val="20"/>
+      </w:rPr>
+    </w:lvl>
+    <w:lvl w:ilvl="5" w:tentative="1">
+      <w:start w:val="1"/>
+      <w:numFmt w:val="bullet"/>
+      <w:lvlText w:val=""/>
+      <w:lvlJc w:val="left"/>
+      <w:pPr>
+        <w:tabs>
+          <w:tab w:val="num" w:pos="4320"/>
+        </w:tabs>
+        <w:ind w:left="4320" w:hanging="360"/>
+      </w:pPr>
+      <w:rPr>
+        <w:rFonts w:ascii="Wingdings" w:hAnsi="Wingdings" w:hint="default"/>
+        <w:sz w:val="20"/>
+      </w:rPr>
+    </w:lvl>
+    <w:lvl w:ilvl="6" w:tentative="1">
+      <w:start w:val="1"/>
+      <w:numFmt w:val="bullet"/>
+      <w:lvlText w:val=""/>
+      <w:lvlJc w:val="left"/>
+      <w:pPr>
+        <w:tabs>
+          <w:tab w:val="num" w:pos="5040"/>
+        </w:tabs>
+        <w:ind w:left="5040" w:hanging="360"/>
+      </w:pPr>
+      <w:rPr>
+        <w:rFonts w:ascii="Wingdings" w:hAnsi="Wingdings" w:hint="default"/>
+        <w:sz w:val="20"/>
+      </w:rPr>
+    </w:lvl>
+    <w:lvl w:ilvl="7" w:tentative="1">
+      <w:start w:val="1"/>
+      <w:numFmt w:val="bullet"/>
+      <w:lvlText w:val=""/>
+      <w:lvlJc w:val="left"/>
+      <w:pPr>
+        <w:tabs>
+          <w:tab w:val="num" w:pos="5760"/>
+        </w:tabs>
+        <w:ind w:left="5760" w:hanging="360"/>
+      </w:pPr>
+      <w:rPr>
+        <w:rFonts w:ascii="Wingdings" w:hAnsi="Wingdings" w:hint="default"/>
+        <w:sz w:val="20"/>
+      </w:rPr>
+    </w:lvl>
+    <w:lvl w:ilvl="8" w:tentative="1">
+      <w:start w:val="1"/>
+      <w:numFmt w:val="bullet"/>
+      <w:lvlText w:val=""/>
+      <w:lvlJc w:val="left"/>
+      <w:pPr>
+        <w:tabs>
+          <w:tab w:val="num" w:pos="6480"/>
+        </w:tabs>
+        <w:ind w:left="6480" w:hanging="360"/>
+      </w:pPr>
+      <w:rPr>
+        <w:rFonts w:ascii="Wingdings" w:hAnsi="Wingdings" w:hint="default"/>
+        <w:sz w:val="20"/>
+      </w:rPr>
+    </w:lvl>
+  </w:abstractNum>
+  <w:abstractNum w:abstractNumId="19" w15:restartNumberingAfterBreak="0">
     <w:nsid w:val="5C8D5117"/>
     <w:multiLevelType w:val="multilevel"/>
     <w:tmpl w:val="6F988428"/>
@@ -7030,7 +8957,156 @@
       </w:rPr>
     </w:lvl>
   </w:abstractNum>
-  <w:abstractNum w:abstractNumId="16" w15:restartNumberingAfterBreak="0">
+  <w:abstractNum w:abstractNumId="20" w15:restartNumberingAfterBreak="0">
+    <w:nsid w:val="62051811"/>
+    <w:multiLevelType w:val="multilevel"/>
+    <w:tmpl w:val="03BA5B84"/>
+    <w:lvl w:ilvl="0">
+      <w:start w:val="1"/>
+      <w:numFmt w:val="bullet"/>
+      <w:lvlText w:val=""/>
+      <w:lvlJc w:val="left"/>
+      <w:pPr>
+        <w:tabs>
+          <w:tab w:val="num" w:pos="720"/>
+        </w:tabs>
+        <w:ind w:left="720" w:hanging="360"/>
+      </w:pPr>
+      <w:rPr>
+        <w:rFonts w:ascii="Symbol" w:hAnsi="Symbol" w:hint="default"/>
+        <w:sz w:val="20"/>
+      </w:rPr>
+    </w:lvl>
+    <w:lvl w:ilvl="1" w:tentative="1">
+      <w:start w:val="1"/>
+      <w:numFmt w:val="bullet"/>
+      <w:lvlText w:val="o"/>
+      <w:lvlJc w:val="left"/>
+      <w:pPr>
+        <w:tabs>
+          <w:tab w:val="num" w:pos="1440"/>
+        </w:tabs>
+        <w:ind w:left="1440" w:hanging="360"/>
+      </w:pPr>
+      <w:rPr>
+        <w:rFonts w:ascii="Courier New" w:hAnsi="Courier New" w:hint="default"/>
+        <w:sz w:val="20"/>
+      </w:rPr>
+    </w:lvl>
+    <w:lvl w:ilvl="2" w:tentative="1">
+      <w:start w:val="1"/>
+      <w:numFmt w:val="bullet"/>
+      <w:lvlText w:val=""/>
+      <w:lvlJc w:val="left"/>
+      <w:pPr>
+        <w:tabs>
+          <w:tab w:val="num" w:pos="2160"/>
+        </w:tabs>
+        <w:ind w:left="2160" w:hanging="360"/>
+      </w:pPr>
+      <w:rPr>
+        <w:rFonts w:ascii="Wingdings" w:hAnsi="Wingdings" w:hint="default"/>
+        <w:sz w:val="20"/>
+      </w:rPr>
+    </w:lvl>
+    <w:lvl w:ilvl="3" w:tentative="1">
+      <w:start w:val="1"/>
+      <w:numFmt w:val="bullet"/>
+      <w:lvlText w:val=""/>
+      <w:lvlJc w:val="left"/>
+      <w:pPr>
+        <w:tabs>
+          <w:tab w:val="num" w:pos="2880"/>
+        </w:tabs>
+        <w:ind w:left="2880" w:hanging="360"/>
+      </w:pPr>
+      <w:rPr>
+        <w:rFonts w:ascii="Wingdings" w:hAnsi="Wingdings" w:hint="default"/>
+        <w:sz w:val="20"/>
+      </w:rPr>
+    </w:lvl>
+    <w:lvl w:ilvl="4" w:tentative="1">
+      <w:start w:val="1"/>
+      <w:numFmt w:val="bullet"/>
+      <w:lvlText w:val=""/>
+      <w:lvlJc w:val="left"/>
+      <w:pPr>
+        <w:tabs>
+          <w:tab w:val="num" w:pos="3600"/>
+        </w:tabs>
+        <w:ind w:left="3600" w:hanging="360"/>
+      </w:pPr>
+      <w:rPr>
+        <w:rFonts w:ascii="Wingdings" w:hAnsi="Wingdings" w:hint="default"/>
+        <w:sz w:val="20"/>
+      </w:rPr>
+    </w:lvl>
+    <w:lvl w:ilvl="5" w:tentative="1">
+      <w:start w:val="1"/>
+      <w:numFmt w:val="bullet"/>
+      <w:lvlText w:val=""/>
+      <w:lvlJc w:val="left"/>
+      <w:pPr>
+        <w:tabs>
+          <w:tab w:val="num" w:pos="4320"/>
+        </w:tabs>
+        <w:ind w:left="4320" w:hanging="360"/>
+      </w:pPr>
+      <w:rPr>
+        <w:rFonts w:ascii="Wingdings" w:hAnsi="Wingdings" w:hint="default"/>
+        <w:sz w:val="20"/>
+      </w:rPr>
+    </w:lvl>
+    <w:lvl w:ilvl="6" w:tentative="1">
+      <w:start w:val="1"/>
+      <w:numFmt w:val="bullet"/>
+      <w:lvlText w:val=""/>
+      <w:lvlJc w:val="left"/>
+      <w:pPr>
+        <w:tabs>
+          <w:tab w:val="num" w:pos="5040"/>
+        </w:tabs>
+        <w:ind w:left="5040" w:hanging="360"/>
+      </w:pPr>
+      <w:rPr>
+        <w:rFonts w:ascii="Wingdings" w:hAnsi="Wingdings" w:hint="default"/>
+        <w:sz w:val="20"/>
+      </w:rPr>
+    </w:lvl>
+    <w:lvl w:ilvl="7" w:tentative="1">
+      <w:start w:val="1"/>
+      <w:numFmt w:val="bullet"/>
+      <w:lvlText w:val=""/>
+      <w:lvlJc w:val="left"/>
+      <w:pPr>
+        <w:tabs>
+          <w:tab w:val="num" w:pos="5760"/>
+        </w:tabs>
+        <w:ind w:left="5760" w:hanging="360"/>
+      </w:pPr>
+      <w:rPr>
+        <w:rFonts w:ascii="Wingdings" w:hAnsi="Wingdings" w:hint="default"/>
+        <w:sz w:val="20"/>
+      </w:rPr>
+    </w:lvl>
+    <w:lvl w:ilvl="8" w:tentative="1">
+      <w:start w:val="1"/>
+      <w:numFmt w:val="bullet"/>
+      <w:lvlText w:val=""/>
+      <w:lvlJc w:val="left"/>
+      <w:pPr>
+        <w:tabs>
+          <w:tab w:val="num" w:pos="6480"/>
+        </w:tabs>
+        <w:ind w:left="6480" w:hanging="360"/>
+      </w:pPr>
+      <w:rPr>
+        <w:rFonts w:ascii="Wingdings" w:hAnsi="Wingdings" w:hint="default"/>
+        <w:sz w:val="20"/>
+      </w:rPr>
+    </w:lvl>
+  </w:abstractNum>
+  <w:abstractNum w:abstractNumId="21" w15:restartNumberingAfterBreak="0">
     <w:nsid w:val="627328FD"/>
     <w:multiLevelType w:val="multilevel"/>
     <w:tmpl w:val="3314F8C2"/>
@@ -7179,7 +9255,7 @@
       </w:rPr>
     </w:lvl>
   </w:abstractNum>
-  <w:abstractNum w:abstractNumId="17" w15:restartNumberingAfterBreak="0">
+  <w:abstractNum w:abstractNumId="22" w15:restartNumberingAfterBreak="0">
     <w:nsid w:val="66686037"/>
     <w:multiLevelType w:val="multilevel"/>
     <w:tmpl w:val="BA249774"/>
@@ -7292,7 +9368,156 @@
       </w:pPr>
     </w:lvl>
   </w:abstractNum>
-  <w:abstractNum w:abstractNumId="18" w15:restartNumberingAfterBreak="0">
+  <w:abstractNum w:abstractNumId="23" w15:restartNumberingAfterBreak="0">
+    <w:nsid w:val="69774307"/>
+    <w:multiLevelType w:val="multilevel"/>
+    <w:tmpl w:val="69B80DCC"/>
+    <w:lvl w:ilvl="0">
+      <w:start w:val="1"/>
+      <w:numFmt w:val="bullet"/>
+      <w:lvlText w:val=""/>
+      <w:lvlJc w:val="left"/>
+      <w:pPr>
+        <w:tabs>
+          <w:tab w:val="num" w:pos="720"/>
+        </w:tabs>
+        <w:ind w:left="720" w:hanging="360"/>
+      </w:pPr>
+      <w:rPr>
+        <w:rFonts w:ascii="Symbol" w:hAnsi="Symbol" w:hint="default"/>
+        <w:sz w:val="20"/>
+      </w:rPr>
+    </w:lvl>
+    <w:lvl w:ilvl="1">
+      <w:start w:val="1"/>
+      <w:numFmt w:val="bullet"/>
+      <w:lvlText w:val="o"/>
+      <w:lvlJc w:val="left"/>
+      <w:pPr>
+        <w:tabs>
+          <w:tab w:val="num" w:pos="1440"/>
+        </w:tabs>
+        <w:ind w:left="1440" w:hanging="360"/>
+      </w:pPr>
+      <w:rPr>
+        <w:rFonts w:ascii="Courier New" w:hAnsi="Courier New" w:hint="default"/>
+        <w:sz w:val="20"/>
+      </w:rPr>
+    </w:lvl>
+    <w:lvl w:ilvl="2" w:tentative="1">
+      <w:start w:val="1"/>
+      <w:numFmt w:val="bullet"/>
+      <w:lvlText w:val=""/>
+      <w:lvlJc w:val="left"/>
+      <w:pPr>
+        <w:tabs>
+          <w:tab w:val="num" w:pos="2160"/>
+        </w:tabs>
+        <w:ind w:left="2160" w:hanging="360"/>
+      </w:pPr>
+      <w:rPr>
+        <w:rFonts w:ascii="Wingdings" w:hAnsi="Wingdings" w:hint="default"/>
+        <w:sz w:val="20"/>
+      </w:rPr>
+    </w:lvl>
+    <w:lvl w:ilvl="3" w:tentative="1">
+      <w:start w:val="1"/>
+      <w:numFmt w:val="bullet"/>
+      <w:lvlText w:val=""/>
+      <w:lvlJc w:val="left"/>
+      <w:pPr>
+        <w:tabs>
+          <w:tab w:val="num" w:pos="2880"/>
+        </w:tabs>
+        <w:ind w:left="2880" w:hanging="360"/>
+      </w:pPr>
+      <w:rPr>
+        <w:rFonts w:ascii="Wingdings" w:hAnsi="Wingdings" w:hint="default"/>
+        <w:sz w:val="20"/>
+      </w:rPr>
+    </w:lvl>
+    <w:lvl w:ilvl="4" w:tentative="1">
+      <w:start w:val="1"/>
+      <w:numFmt w:val="bullet"/>
+      <w:lvlText w:val=""/>
+      <w:lvlJc w:val="left"/>
+      <w:pPr>
+        <w:tabs>
+          <w:tab w:val="num" w:pos="3600"/>
+        </w:tabs>
+        <w:ind w:left="3600" w:hanging="360"/>
+      </w:pPr>
+      <w:rPr>
+        <w:rFonts w:ascii="Wingdings" w:hAnsi="Wingdings" w:hint="default"/>
+        <w:sz w:val="20"/>
+      </w:rPr>
+    </w:lvl>
+    <w:lvl w:ilvl="5" w:tentative="1">
+      <w:start w:val="1"/>
+      <w:numFmt w:val="bullet"/>
+      <w:lvlText w:val=""/>
+      <w:lvlJc w:val="left"/>
+      <w:pPr>
+        <w:tabs>
+          <w:tab w:val="num" w:pos="4320"/>
+        </w:tabs>
+        <w:ind w:left="4320" w:hanging="360"/>
+      </w:pPr>
+      <w:rPr>
+        <w:rFonts w:ascii="Wingdings" w:hAnsi="Wingdings" w:hint="default"/>
+        <w:sz w:val="20"/>
+      </w:rPr>
+    </w:lvl>
+    <w:lvl w:ilvl="6" w:tentative="1">
+      <w:start w:val="1"/>
+      <w:numFmt w:val="bullet"/>
+      <w:lvlText w:val=""/>
+      <w:lvlJc w:val="left"/>
+      <w:pPr>
+        <w:tabs>
+          <w:tab w:val="num" w:pos="5040"/>
+        </w:tabs>
+        <w:ind w:left="5040" w:hanging="360"/>
+      </w:pPr>
+      <w:rPr>
+        <w:rFonts w:ascii="Wingdings" w:hAnsi="Wingdings" w:hint="default"/>
+        <w:sz w:val="20"/>
+      </w:rPr>
+    </w:lvl>
+    <w:lvl w:ilvl="7" w:tentative="1">
+      <w:start w:val="1"/>
+      <w:numFmt w:val="bullet"/>
+      <w:lvlText w:val=""/>
+      <w:lvlJc w:val="left"/>
+      <w:pPr>
+        <w:tabs>
+          <w:tab w:val="num" w:pos="5760"/>
+        </w:tabs>
+        <w:ind w:left="5760" w:hanging="360"/>
+      </w:pPr>
+      <w:rPr>
+        <w:rFonts w:ascii="Wingdings" w:hAnsi="Wingdings" w:hint="default"/>
+        <w:sz w:val="20"/>
+      </w:rPr>
+    </w:lvl>
+    <w:lvl w:ilvl="8" w:tentative="1">
+      <w:start w:val="1"/>
+      <w:numFmt w:val="bullet"/>
+      <w:lvlText w:val=""/>
+      <w:lvlJc w:val="left"/>
+      <w:pPr>
+        <w:tabs>
+          <w:tab w:val="num" w:pos="6480"/>
+        </w:tabs>
+        <w:ind w:left="6480" w:hanging="360"/>
+      </w:pPr>
+      <w:rPr>
+        <w:rFonts w:ascii="Wingdings" w:hAnsi="Wingdings" w:hint="default"/>
+        <w:sz w:val="20"/>
+      </w:rPr>
+    </w:lvl>
+  </w:abstractNum>
+  <w:abstractNum w:abstractNumId="24" w15:restartNumberingAfterBreak="0">
     <w:nsid w:val="6A1565F5"/>
     <w:multiLevelType w:val="multilevel"/>
     <w:tmpl w:val="55C834BA"/>
@@ -7441,7 +9666,7 @@
       </w:rPr>
     </w:lvl>
   </w:abstractNum>
-  <w:abstractNum w:abstractNumId="19" w15:restartNumberingAfterBreak="0">
+  <w:abstractNum w:abstractNumId="25" w15:restartNumberingAfterBreak="0">
     <w:nsid w:val="7F9C61DD"/>
     <w:multiLevelType w:val="multilevel"/>
     <w:tmpl w:val="5BB6DE40"/>
@@ -7591,63 +9816,81 @@
     </w:lvl>
   </w:abstractNum>
   <w:num w:numId="1" w16cid:durableId="197007281">
-    <w:abstractNumId w:val="5"/>
+    <w:abstractNumId w:val="6"/>
   </w:num>
   <w:num w:numId="2" w16cid:durableId="123547876">
     <w:abstractNumId w:val="2"/>
   </w:num>
   <w:num w:numId="3" w16cid:durableId="1627420682">
-    <w:abstractNumId w:val="14"/>
+    <w:abstractNumId w:val="17"/>
   </w:num>
   <w:num w:numId="4" w16cid:durableId="479231708">
+    <w:abstractNumId w:val="15"/>
+  </w:num>
+  <w:num w:numId="5" w16cid:durableId="1973367036">
+    <w:abstractNumId w:val="22"/>
+  </w:num>
+  <w:num w:numId="6" w16cid:durableId="1485465316">
+    <w:abstractNumId w:val="21"/>
+  </w:num>
+  <w:num w:numId="7" w16cid:durableId="277689442">
     <w:abstractNumId w:val="12"/>
   </w:num>
-  <w:num w:numId="5" w16cid:durableId="1973367036">
-    <w:abstractNumId w:val="17"/>
+  <w:num w:numId="8" w16cid:durableId="2016105192">
+    <w:abstractNumId w:val="8"/>
   </w:num>
-  <w:num w:numId="6" w16cid:durableId="1485465316">
-    <w:abstractNumId w:val="16"/>
-  </w:num>
-  <w:num w:numId="7" w16cid:durableId="277689442">
+  <w:num w:numId="9" w16cid:durableId="243103607">
     <w:abstractNumId w:val="10"/>
   </w:num>
-  <w:num w:numId="8" w16cid:durableId="2016105192">
-    <w:abstractNumId w:val="7"/>
-  </w:num>
-  <w:num w:numId="9" w16cid:durableId="243103607">
-    <w:abstractNumId w:val="9"/>
-  </w:num>
   <w:num w:numId="10" w16cid:durableId="2044623350">
-    <w:abstractNumId w:val="19"/>
+    <w:abstractNumId w:val="25"/>
   </w:num>
   <w:num w:numId="11" w16cid:durableId="1028026139">
-    <w:abstractNumId w:val="6"/>
+    <w:abstractNumId w:val="7"/>
   </w:num>
   <w:num w:numId="12" w16cid:durableId="46297760">
     <w:abstractNumId w:val="3"/>
   </w:num>
   <w:num w:numId="13" w16cid:durableId="1408919817">
-    <w:abstractNumId w:val="13"/>
+    <w:abstractNumId w:val="16"/>
   </w:num>
   <w:num w:numId="14" w16cid:durableId="631447393">
-    <w:abstractNumId w:val="8"/>
+    <w:abstractNumId w:val="9"/>
   </w:num>
   <w:num w:numId="15" w16cid:durableId="242567421">
-    <w:abstractNumId w:val="4"/>
+    <w:abstractNumId w:val="5"/>
   </w:num>
   <w:num w:numId="16" w16cid:durableId="1035428171">
-    <w:abstractNumId w:val="15"/>
+    <w:abstractNumId w:val="19"/>
   </w:num>
   <w:num w:numId="17" w16cid:durableId="920410499">
     <w:abstractNumId w:val="0"/>
   </w:num>
   <w:num w:numId="18" w16cid:durableId="14575576">
-    <w:abstractNumId w:val="11"/>
+    <w:abstractNumId w:val="14"/>
   </w:num>
   <w:num w:numId="19" w16cid:durableId="1909342818">
     <w:abstractNumId w:val="1"/>
   </w:num>
   <w:num w:numId="20" w16cid:durableId="159929573">
+    <w:abstractNumId w:val="24"/>
+  </w:num>
+  <w:num w:numId="21" w16cid:durableId="935552289">
+    <w:abstractNumId w:val="20"/>
+  </w:num>
+  <w:num w:numId="22" w16cid:durableId="1643345482">
+    <w:abstractNumId w:val="23"/>
+  </w:num>
+  <w:num w:numId="23" w16cid:durableId="1982298085">
+    <w:abstractNumId w:val="11"/>
+  </w:num>
+  <w:num w:numId="24" w16cid:durableId="901019807">
+    <w:abstractNumId w:val="4"/>
+  </w:num>
+  <w:num w:numId="25" w16cid:durableId="1535001659">
+    <w:abstractNumId w:val="13"/>
+  </w:num>
+  <w:num w:numId="26" w16cid:durableId="633609265">
     <w:abstractNumId w:val="18"/>
   </w:num>
 </w:numbering>

</xml_diff>